<commit_message>
docs: Move generated PDF and DOCX files to their correct directories
</commit_message>
<xml_diff>
--- a/docx/v6/1_MVP版/遊戲平台管理系統_UI設計_整合版_MVP.docx
+++ b/docx/v6/1_MVP版/遊戲平台管理系統_UI設計_整合版_MVP.docx
@@ -2,7 +2,7 @@
 <file path=word/document.xml><?xml version="1.0" encoding="utf-8"?>
 <w:document xmlns:w="http://schemas.openxmlformats.org/wordprocessingml/2006/main" xmlns:m="http://schemas.openxmlformats.org/officeDocument/2006/math" xmlns:r="http://schemas.openxmlformats.org/officeDocument/2006/relationships" xmlns:o="urn:schemas-microsoft-com:office:office" xmlns:v="urn:schemas-microsoft-com:vml" xmlns:w10="urn:schemas-microsoft-com:office:word" xmlns:a="http://schemas.openxmlformats.org/drawingml/2006/main" xmlns:pic="http://schemas.openxmlformats.org/drawingml/2006/picture" xmlns:wp="http://schemas.openxmlformats.org/drawingml/2006/wordprocessingDrawing">
   <w:body>
-    <w:bookmarkStart w:id="51" w:name="ui-設計詳細說明文件"/>
+    <w:bookmarkStart w:id="69" w:name="ui-設計詳細說明文件"/>
     <w:p>
       <w:pPr>
         <w:pStyle w:val="Heading1"/>
@@ -2116,7 +2116,7 @@
     </w:p>
     <w:bookmarkEnd w:id="22"/>
     <w:bookmarkEnd w:id="23"/>
-    <w:bookmarkStart w:id="32" w:name="介面設計文字框"/>
+    <w:bookmarkStart w:id="50" w:name="介面設計文字框"/>
     <w:p>
       <w:pPr>
         <w:pStyle w:val="Heading2"/>
@@ -2131,7 +2131,7 @@
         <w:t xml:space="preserve">介面設計文字框</w:t>
       </w:r>
     </w:p>
-    <w:bookmarkStart w:id="28" w:name="集中式後台-central-backend"/>
+    <w:bookmarkStart w:id="40" w:name="集中式後台-central-backend"/>
     <w:p>
       <w:pPr>
         <w:pStyle w:val="Heading3"/>
@@ -2149,7 +2149,7 @@
         <w:t xml:space="preserve"> (Central Backend)</w:t>
       </w:r>
     </w:p>
-    <w:bookmarkStart w:id="24" w:name="畫面-1-登入頁面"/>
+    <w:bookmarkStart w:id="27" w:name="畫面-1-登入頁面"/>
     <w:p>
       <w:pPr>
         <w:pStyle w:val="Heading4"/>
@@ -2172,253 +2172,64 @@
     </w:p>
     <w:p>
       <w:pPr>
-        <w:pStyle w:val="SourceCode"/>
-      </w:pPr>
-      <w:r>
-        <w:rPr>
-          <w:rStyle w:val="VerbatimChar"/>
-        </w:rPr>
-        <w:t xml:space="preserve">+======================================================================+</w:t>
-      </w:r>
-      <w:r>
-        <w:br/>
-      </w:r>
-      <w:r>
-        <w:rPr>
-          <w:rStyle w:val="VerbatimChar"/>
-        </w:rPr>
-        <w:t xml:space="preserve">|                                                                      |</w:t>
-      </w:r>
-      <w:r>
-        <w:br/>
-      </w:r>
-      <w:r>
-        <w:rPr>
-          <w:rStyle w:val="VerbatimChar"/>
-        </w:rPr>
-        <w:t xml:space="preserve">|                    </w:t>
-      </w:r>
-      <w:r>
-        <w:rPr>
-          <w:rStyle w:val="VerbatimChar"/>
-          <w:rFonts w:hint="eastAsia"/>
-        </w:rPr>
-        <w:t xml:space="preserve">遊戲平台管理系統</w:t>
-      </w:r>
-      <w:r>
-        <w:rPr>
-          <w:rStyle w:val="VerbatimChar"/>
-        </w:rPr>
-        <w:t xml:space="preserve">                                    |</w:t>
-      </w:r>
-      <w:r>
-        <w:br/>
-      </w:r>
-      <w:r>
-        <w:rPr>
-          <w:rStyle w:val="VerbatimChar"/>
-        </w:rPr>
-        <w:t xml:space="preserve">|                         LOGO                                          |</w:t>
-      </w:r>
-      <w:r>
-        <w:br/>
-      </w:r>
-      <w:r>
-        <w:rPr>
-          <w:rStyle w:val="VerbatimChar"/>
-        </w:rPr>
-        <w:t xml:space="preserve">|                                                                      |</w:t>
-      </w:r>
-      <w:r>
-        <w:br/>
-      </w:r>
-      <w:r>
-        <w:rPr>
-          <w:rStyle w:val="VerbatimChar"/>
-        </w:rPr>
-        <w:t xml:space="preserve">|  +--------------------------------------------------------------+   |</w:t>
-      </w:r>
-      <w:r>
-        <w:br/>
-      </w:r>
-      <w:r>
-        <w:rPr>
-          <w:rStyle w:val="VerbatimChar"/>
-        </w:rPr>
-        <w:t xml:space="preserve">|  |  </w:t>
-      </w:r>
-      <w:r>
-        <w:rPr>
-          <w:rStyle w:val="VerbatimChar"/>
-          <w:rFonts w:hint="eastAsia"/>
-        </w:rPr>
-        <w:t xml:space="preserve">使用者帳號:</w:t>
-      </w:r>
-      <w:r>
-        <w:rPr>
-          <w:rStyle w:val="VerbatimChar"/>
-        </w:rPr>
-        <w:t xml:space="preserve">                                                   |   |</w:t>
-      </w:r>
-      <w:r>
-        <w:br/>
-      </w:r>
-      <w:r>
-        <w:rPr>
-          <w:rStyle w:val="VerbatimChar"/>
-        </w:rPr>
-        <w:t xml:space="preserve">|  |  [ admin                                              ]       |   |</w:t>
-      </w:r>
-      <w:r>
-        <w:br/>
-      </w:r>
-      <w:r>
-        <w:rPr>
-          <w:rStyle w:val="VerbatimChar"/>
-        </w:rPr>
-        <w:t xml:space="preserve">|  +--------------------------------------------------------------+   |</w:t>
-      </w:r>
-      <w:r>
-        <w:br/>
-      </w:r>
-      <w:r>
-        <w:rPr>
-          <w:rStyle w:val="VerbatimChar"/>
-        </w:rPr>
-        <w:t xml:space="preserve">|                                                                      |</w:t>
-      </w:r>
-      <w:r>
-        <w:br/>
-      </w:r>
-      <w:r>
-        <w:rPr>
-          <w:rStyle w:val="VerbatimChar"/>
-        </w:rPr>
-        <w:t xml:space="preserve">|  +--------------------------------------------------------------+   |</w:t>
-      </w:r>
-      <w:r>
-        <w:br/>
-      </w:r>
-      <w:r>
-        <w:rPr>
-          <w:rStyle w:val="VerbatimChar"/>
-        </w:rPr>
-        <w:t xml:space="preserve">|  |  </w:t>
-      </w:r>
-      <w:r>
-        <w:rPr>
-          <w:rStyle w:val="VerbatimChar"/>
-          <w:rFonts w:hint="eastAsia"/>
-        </w:rPr>
-        <w:t xml:space="preserve">密碼:</w:t>
-      </w:r>
-      <w:r>
-        <w:rPr>
-          <w:rStyle w:val="VerbatimChar"/>
-        </w:rPr>
-        <w:t xml:space="preserve">                                                         |   |</w:t>
-      </w:r>
-      <w:r>
-        <w:br/>
-      </w:r>
-      <w:r>
-        <w:rPr>
-          <w:rStyle w:val="VerbatimChar"/>
-        </w:rPr>
-        <w:t xml:space="preserve">|  |  [ ************************************ ]                    |   |</w:t>
-      </w:r>
-      <w:r>
-        <w:br/>
-      </w:r>
-      <w:r>
-        <w:rPr>
-          <w:rStyle w:val="VerbatimChar"/>
-        </w:rPr>
-        <w:t xml:space="preserve">|  +--------------------------------------------------------------+   |</w:t>
-      </w:r>
-      <w:r>
-        <w:br/>
-      </w:r>
-      <w:r>
-        <w:rPr>
-          <w:rStyle w:val="VerbatimChar"/>
-        </w:rPr>
-        <w:t xml:space="preserve">|                                                                      |</w:t>
-      </w:r>
-      <w:r>
-        <w:br/>
-      </w:r>
-      <w:r>
-        <w:rPr>
-          <w:rStyle w:val="VerbatimChar"/>
-        </w:rPr>
-        <w:t xml:space="preserve">|              [ </w:t>
-      </w:r>
-      <w:r>
-        <w:rPr>
-          <w:rStyle w:val="VerbatimChar"/>
-          <w:rFonts w:hint="eastAsia"/>
-        </w:rPr>
-        <w:t xml:space="preserve">登入</w:t>
-      </w:r>
-      <w:r>
-        <w:rPr>
-          <w:rStyle w:val="VerbatimChar"/>
-        </w:rPr>
-        <w:t xml:space="preserve"> ]                                                |</w:t>
-      </w:r>
-      <w:r>
-        <w:br/>
-      </w:r>
-      <w:r>
-        <w:rPr>
-          <w:rStyle w:val="VerbatimChar"/>
-        </w:rPr>
-        <w:t xml:space="preserve">|                                                                      |</w:t>
-      </w:r>
-      <w:r>
-        <w:br/>
-      </w:r>
-      <w:r>
-        <w:rPr>
-          <w:rStyle w:val="VerbatimChar"/>
-        </w:rPr>
-        <w:t xml:space="preserve">|  © 2026 </w:t>
-      </w:r>
-      <w:r>
-        <w:rPr>
-          <w:rStyle w:val="VerbatimChar"/>
-          <w:rFonts w:hint="eastAsia"/>
-        </w:rPr>
-        <w:t xml:space="preserve">遊戲平台管理系統</w:t>
-      </w:r>
-      <w:r>
-        <w:rPr>
-          <w:rStyle w:val="VerbatimChar"/>
-        </w:rPr>
-        <w:t xml:space="preserve"> v1.0                                       |</w:t>
-      </w:r>
-      <w:r>
-        <w:br/>
-      </w:r>
-      <w:r>
-        <w:rPr>
-          <w:rStyle w:val="VerbatimChar"/>
-        </w:rPr>
-        <w:t xml:space="preserve">|                                                                      |</w:t>
-      </w:r>
-      <w:r>
-        <w:br/>
-      </w:r>
-      <w:r>
-        <w:rPr>
-          <w:rStyle w:val="VerbatimChar"/>
-        </w:rPr>
-        <w:t xml:space="preserve">+======================================================================+</w:t>
-      </w:r>
-    </w:p>
-    <w:bookmarkEnd w:id="24"/>
-    <w:bookmarkStart w:id="25" w:name="畫面-2-實用的數據清單-無圖表但好用"/>
+        <w:pStyle w:val="CaptionedFigure"/>
+      </w:pPr>
+      <w:r>
+        <w:drawing>
+          <wp:inline>
+            <wp:extent cx="5334000" cy="3333750"/>
+            <wp:effectExtent b="0" l="0" r="0" t="0"/>
+            <wp:docPr descr="登入頁面" title="" id="25" name="Picture"/>
+            <a:graphic>
+              <a:graphicData uri="http://schemas.openxmlformats.org/drawingml/2006/picture">
+                <pic:pic>
+                  <pic:nvPicPr>
+                    <pic:cNvPr descr="../assets/mockup_login.png" id="26" name="Picture"/>
+                    <pic:cNvPicPr>
+                      <a:picLocks noChangeArrowheads="1" noChangeAspect="1"/>
+                    </pic:cNvPicPr>
+                  </pic:nvPicPr>
+                  <pic:blipFill>
+                    <a:blip r:embed="rId24"/>
+                    <a:stretch>
+                      <a:fillRect/>
+                    </a:stretch>
+                  </pic:blipFill>
+                  <pic:spPr bwMode="auto">
+                    <a:xfrm>
+                      <a:off x="0" y="0"/>
+                      <a:ext cx="5334000" cy="3333750"/>
+                    </a:xfrm>
+                    <a:prstGeom prst="rect">
+                      <a:avLst/>
+                    </a:prstGeom>
+                    <a:noFill/>
+                    <a:ln w="9525">
+                      <a:noFill/>
+                      <a:headEnd/>
+                      <a:tailEnd/>
+                    </a:ln>
+                  </pic:spPr>
+                </pic:pic>
+              </a:graphicData>
+            </a:graphic>
+          </wp:inline>
+        </w:drawing>
+      </w:r>
+    </w:p>
+    <w:p>
+      <w:pPr>
+        <w:pStyle w:val="ImageCaption"/>
+      </w:pPr>
+      <w:r>
+        <w:rPr>
+          <w:rFonts w:hint="eastAsia"/>
+        </w:rPr>
+        <w:t xml:space="preserve">登入頁面</w:t>
+      </w:r>
+    </w:p>
+    <w:bookmarkEnd w:id="27"/>
+    <w:bookmarkStart w:id="31" w:name="畫面-2-實用的數據清單-無圖表但好用"/>
     <w:p>
       <w:pPr>
         <w:pStyle w:val="Heading4"/>
@@ -2450,634 +2261,64 @@
     </w:p>
     <w:p>
       <w:pPr>
-        <w:pStyle w:val="SourceCode"/>
-      </w:pPr>
-      <w:r>
-        <w:rPr>
-          <w:rStyle w:val="VerbatimChar"/>
-        </w:rPr>
-        <w:t xml:space="preserve">+======================================================================+</w:t>
-      </w:r>
-      <w:r>
-        <w:br/>
-      </w:r>
-      <w:r>
-        <w:rPr>
-          <w:rStyle w:val="VerbatimChar"/>
-        </w:rPr>
-        <w:t xml:space="preserve">|  </w:t>
-      </w:r>
-      <w:r>
-        <w:rPr>
-          <w:rStyle w:val="VerbatimChar"/>
-          <w:rFonts w:hint="eastAsia"/>
-        </w:rPr>
-        <w:t xml:space="preserve">[系統LOGO]</w:t>
-      </w:r>
-      <w:r>
-        <w:rPr>
-          <w:rStyle w:val="VerbatimChar"/>
-        </w:rPr>
-        <w:t xml:space="preserve">    </w:t>
-      </w:r>
-      <w:r>
-        <w:rPr>
-          <w:rStyle w:val="VerbatimChar"/>
-          <w:rFonts w:hint="eastAsia"/>
-        </w:rPr>
-        <w:t xml:space="preserve">[機台管理]</w:t>
-      </w:r>
-      <w:r>
-        <w:rPr>
-          <w:rStyle w:val="VerbatimChar"/>
-        </w:rPr>
-        <w:t xml:space="preserve"> </w:t>
-      </w:r>
-      <w:r>
-        <w:rPr>
-          <w:rStyle w:val="VerbatimChar"/>
-          <w:rFonts w:hint="eastAsia"/>
-        </w:rPr>
-        <w:t xml:space="preserve">[遊戲管理]</w:t>
-      </w:r>
-      <w:r>
-        <w:rPr>
-          <w:rStyle w:val="VerbatimChar"/>
-        </w:rPr>
-        <w:t xml:space="preserve"> </w:t>
-      </w:r>
-      <w:r>
-        <w:rPr>
-          <w:rStyle w:val="VerbatimChar"/>
-          <w:rFonts w:hint="eastAsia"/>
-        </w:rPr>
-        <w:t xml:space="preserve">[玩家管理]</w:t>
-      </w:r>
-      <w:r>
-        <w:rPr>
-          <w:rStyle w:val="VerbatimChar"/>
-        </w:rPr>
-        <w:t xml:space="preserve"> </w:t>
-      </w:r>
-      <w:r>
-        <w:rPr>
-          <w:rStyle w:val="VerbatimChar"/>
-          <w:rFonts w:hint="eastAsia"/>
-        </w:rPr>
-        <w:t xml:space="preserve">[交易]</w:t>
-      </w:r>
-      <w:r>
-        <w:rPr>
-          <w:rStyle w:val="VerbatimChar"/>
-        </w:rPr>
-        <w:t xml:space="preserve"> </w:t>
-      </w:r>
-      <w:r>
-        <w:rPr>
-          <w:rStyle w:val="VerbatimChar"/>
-          <w:rFonts w:hint="eastAsia"/>
-        </w:rPr>
-        <w:t xml:space="preserve">[權限]</w:t>
-      </w:r>
-      <w:r>
-        <w:rPr>
-          <w:rStyle w:val="VerbatimChar"/>
-        </w:rPr>
-        <w:t xml:space="preserve"> </w:t>
-      </w:r>
-      <w:r>
-        <w:rPr>
-          <w:rStyle w:val="VerbatimChar"/>
-          <w:rFonts w:hint="eastAsia"/>
-        </w:rPr>
-        <w:t xml:space="preserve">[登出]</w:t>
-      </w:r>
-      <w:r>
-        <w:rPr>
-          <w:rStyle w:val="VerbatimChar"/>
-        </w:rPr>
-        <w:t xml:space="preserve">   |</w:t>
-      </w:r>
-      <w:r>
-        <w:br/>
-      </w:r>
-      <w:r>
-        <w:rPr>
-          <w:rStyle w:val="VerbatimChar"/>
-        </w:rPr>
-        <w:t xml:space="preserve">+======================================================================+</w:t>
-      </w:r>
-      <w:r>
-        <w:br/>
-      </w:r>
-      <w:r>
-        <w:rPr>
-          <w:rStyle w:val="VerbatimChar"/>
-        </w:rPr>
-        <w:t xml:space="preserve">|                                                                      |</w:t>
-      </w:r>
-      <w:r>
-        <w:br/>
-      </w:r>
-      <w:r>
-        <w:rPr>
-          <w:rStyle w:val="VerbatimChar"/>
-        </w:rPr>
-        <w:t xml:space="preserve">|  ████ KPI </w:t>
-      </w:r>
-      <w:r>
-        <w:rPr>
-          <w:rStyle w:val="VerbatimChar"/>
-          <w:rFonts w:hint="eastAsia"/>
-        </w:rPr>
-        <w:t xml:space="preserve">總覽</w:t>
-      </w:r>
-      <w:r>
-        <w:rPr>
-          <w:rStyle w:val="VerbatimChar"/>
-        </w:rPr>
-        <w:t xml:space="preserve"> ████  </w:t>
-      </w:r>
-      <w:r>
-        <w:rPr>
-          <w:rStyle w:val="VerbatimChar"/>
-          <w:rFonts w:hint="eastAsia"/>
-        </w:rPr>
-        <w:t xml:space="preserve">[今日營收]</w:t>
-      </w:r>
-      <w:r>
-        <w:rPr>
-          <w:rStyle w:val="VerbatimChar"/>
-        </w:rPr>
-        <w:t xml:space="preserve"> </w:t>
-      </w:r>
-      <w:r>
-        <w:rPr>
-          <w:rStyle w:val="VerbatimChar"/>
-          <w:rFonts w:hint="eastAsia"/>
-        </w:rPr>
-        <w:t xml:space="preserve">[總下注額]</w:t>
-      </w:r>
-      <w:r>
-        <w:rPr>
-          <w:rStyle w:val="VerbatimChar"/>
-        </w:rPr>
-        <w:t xml:space="preserve"> </w:t>
-      </w:r>
-      <w:r>
-        <w:rPr>
-          <w:rStyle w:val="VerbatimChar"/>
-          <w:rFonts w:hint="eastAsia"/>
-        </w:rPr>
-        <w:t xml:space="preserve">[總派彩額]</w:t>
-      </w:r>
-      <w:r>
-        <w:rPr>
-          <w:rStyle w:val="VerbatimChar"/>
-        </w:rPr>
-        <w:t xml:space="preserve"> </w:t>
-      </w:r>
-      <w:r>
-        <w:rPr>
-          <w:rStyle w:val="VerbatimChar"/>
-          <w:rFonts w:hint="eastAsia"/>
-        </w:rPr>
-        <w:t xml:space="preserve">[線上機台]</w:t>
-      </w:r>
-      <w:r>
-        <w:rPr>
-          <w:rStyle w:val="VerbatimChar"/>
-        </w:rPr>
-        <w:t xml:space="preserve">      |</w:t>
-      </w:r>
-      <w:r>
-        <w:br/>
-      </w:r>
-      <w:r>
-        <w:rPr>
-          <w:rStyle w:val="VerbatimChar"/>
-        </w:rPr>
-        <w:t xml:space="preserve">|                                                                      |</w:t>
-      </w:r>
-      <w:r>
-        <w:br/>
-      </w:r>
-      <w:r>
-        <w:rPr>
-          <w:rStyle w:val="VerbatimChar"/>
-        </w:rPr>
-        <w:t xml:space="preserve">|  +----------------------------------------------------------------+  |</w:t>
-      </w:r>
-      <w:r>
-        <w:br/>
-      </w:r>
-      <w:r>
-        <w:rPr>
-          <w:rStyle w:val="VerbatimChar"/>
-        </w:rPr>
-        <w:t xml:space="preserve">|  | 🔍 </w:t>
-      </w:r>
-      <w:r>
-        <w:rPr>
-          <w:rStyle w:val="VerbatimChar"/>
-          <w:rFonts w:hint="eastAsia"/>
-        </w:rPr>
-        <w:t xml:space="preserve">搜尋...</w:t>
-      </w:r>
-      <w:r>
-        <w:rPr>
-          <w:rStyle w:val="VerbatimChar"/>
-        </w:rPr>
-        <w:t xml:space="preserve">  | </w:t>
-      </w:r>
-      <w:r>
-        <w:rPr>
-          <w:rStyle w:val="VerbatimChar"/>
-          <w:rFonts w:hint="eastAsia"/>
-        </w:rPr>
-        <w:t xml:space="preserve">日期區間</w:t>
-      </w:r>
-      <w:r>
-        <w:rPr>
-          <w:rStyle w:val="VerbatimChar"/>
-        </w:rPr>
-        <w:t xml:space="preserve"> ▼ | </w:t>
-      </w:r>
-      <w:r>
-        <w:rPr>
-          <w:rStyle w:val="VerbatimChar"/>
-          <w:rFonts w:hint="eastAsia"/>
-        </w:rPr>
-        <w:t xml:space="preserve">機台</w:t>
-      </w:r>
-      <w:r>
-        <w:rPr>
-          <w:rStyle w:val="VerbatimChar"/>
-        </w:rPr>
-        <w:t xml:space="preserve"> ▼ | </w:t>
-      </w:r>
-      <w:r>
-        <w:rPr>
-          <w:rStyle w:val="VerbatimChar"/>
-          <w:rFonts w:hint="eastAsia"/>
-        </w:rPr>
-        <w:t xml:space="preserve">遊戲</w:t>
-      </w:r>
-      <w:r>
-        <w:rPr>
-          <w:rStyle w:val="VerbatimChar"/>
-        </w:rPr>
-        <w:t xml:space="preserve"> ▼ | </w:t>
-      </w:r>
-      <w:r>
-        <w:rPr>
-          <w:rStyle w:val="VerbatimChar"/>
-          <w:rFonts w:hint="eastAsia"/>
-        </w:rPr>
-        <w:t xml:space="preserve">[匯出]</w:t>
-      </w:r>
-      <w:r>
-        <w:rPr>
-          <w:rStyle w:val="VerbatimChar"/>
-        </w:rPr>
-        <w:t xml:space="preserve"> </w:t>
-      </w:r>
-      <w:r>
-        <w:rPr>
-          <w:rStyle w:val="VerbatimChar"/>
-          <w:rFonts w:hint="eastAsia"/>
-        </w:rPr>
-        <w:t xml:space="preserve">[篩選]</w:t>
-      </w:r>
-      <w:r>
-        <w:rPr>
-          <w:rStyle w:val="VerbatimChar"/>
-        </w:rPr>
-        <w:t xml:space="preserve">     |  |</w:t>
-      </w:r>
-      <w:r>
-        <w:br/>
-      </w:r>
-      <w:r>
-        <w:rPr>
-          <w:rStyle w:val="VerbatimChar"/>
-        </w:rPr>
-        <w:t xml:space="preserve">|  +----------------------------------------------------------------+  |</w:t>
-      </w:r>
-      <w:r>
-        <w:br/>
-      </w:r>
-      <w:r>
-        <w:rPr>
-          <w:rStyle w:val="VerbatimChar"/>
-        </w:rPr>
-        <w:t xml:space="preserve">|  | # | </w:t>
-      </w:r>
-      <w:r>
-        <w:rPr>
-          <w:rStyle w:val="VerbatimChar"/>
-          <w:rFonts w:hint="eastAsia"/>
-        </w:rPr>
-        <w:t xml:space="preserve">機台名稱</w:t>
-      </w:r>
-      <w:r>
-        <w:rPr>
-          <w:rStyle w:val="VerbatimChar"/>
-        </w:rPr>
-        <w:t xml:space="preserve"> | </w:t>
-      </w:r>
-      <w:r>
-        <w:rPr>
-          <w:rStyle w:val="VerbatimChar"/>
-          <w:rFonts w:hint="eastAsia"/>
-        </w:rPr>
-        <w:t xml:space="preserve">遊戲</w:t>
-      </w:r>
-      <w:r>
-        <w:rPr>
-          <w:rStyle w:val="VerbatimChar"/>
-        </w:rPr>
-        <w:t xml:space="preserve"> | </w:t>
-      </w:r>
-      <w:r>
-        <w:rPr>
-          <w:rStyle w:val="VerbatimChar"/>
-          <w:rFonts w:hint="eastAsia"/>
-        </w:rPr>
-        <w:t xml:space="preserve">玩家</w:t>
-      </w:r>
-      <w:r>
-        <w:rPr>
-          <w:rStyle w:val="VerbatimChar"/>
-        </w:rPr>
-        <w:t xml:space="preserve"> | </w:t>
-      </w:r>
-      <w:r>
-        <w:rPr>
-          <w:rStyle w:val="VerbatimChar"/>
-          <w:rFonts w:hint="eastAsia"/>
-        </w:rPr>
-        <w:t xml:space="preserve">金額</w:t>
-      </w:r>
-      <w:r>
-        <w:rPr>
-          <w:rStyle w:val="VerbatimChar"/>
-        </w:rPr>
-        <w:t xml:space="preserve"> | </w:t>
-      </w:r>
-      <w:r>
-        <w:rPr>
-          <w:rStyle w:val="VerbatimChar"/>
-          <w:rFonts w:hint="eastAsia"/>
-        </w:rPr>
-        <w:t xml:space="preserve">類型</w:t>
-      </w:r>
-      <w:r>
-        <w:rPr>
-          <w:rStyle w:val="VerbatimChar"/>
-        </w:rPr>
-        <w:t xml:space="preserve"> | </w:t>
-      </w:r>
-      <w:r>
-        <w:rPr>
-          <w:rStyle w:val="VerbatimChar"/>
-          <w:rFonts w:hint="eastAsia"/>
-        </w:rPr>
-        <w:t xml:space="preserve">時間</w:t>
-      </w:r>
-      <w:r>
-        <w:rPr>
-          <w:rStyle w:val="VerbatimChar"/>
-        </w:rPr>
-        <w:t xml:space="preserve"> | </w:t>
-      </w:r>
-      <w:r>
-        <w:rPr>
-          <w:rStyle w:val="VerbatimChar"/>
-          <w:rFonts w:hint="eastAsia"/>
-        </w:rPr>
-        <w:t xml:space="preserve">狀態</w:t>
-      </w:r>
-      <w:r>
-        <w:rPr>
-          <w:rStyle w:val="VerbatimChar"/>
-        </w:rPr>
-        <w:t xml:space="preserve"> |       |  |</w:t>
-      </w:r>
-      <w:r>
-        <w:br/>
-      </w:r>
-      <w:r>
-        <w:rPr>
-          <w:rStyle w:val="VerbatimChar"/>
-        </w:rPr>
-        <w:t xml:space="preserve">|  |---|---------|------|------|------|------|------|------|       |</w:t>
-      </w:r>
-      <w:r>
-        <w:br/>
-      </w:r>
-      <w:r>
-        <w:rPr>
-          <w:rStyle w:val="VerbatimChar"/>
-        </w:rPr>
-        <w:t xml:space="preserve">|  | 1 | </w:t>
-      </w:r>
-      <w:r>
-        <w:rPr>
-          <w:rStyle w:val="VerbatimChar"/>
-          <w:rFonts w:hint="eastAsia"/>
-        </w:rPr>
-        <w:t xml:space="preserve">機台A-01</w:t>
-      </w:r>
-      <w:r>
-        <w:rPr>
-          <w:rStyle w:val="VerbatimChar"/>
-        </w:rPr>
-        <w:t xml:space="preserve"> | </w:t>
-      </w:r>
-      <w:r>
-        <w:rPr>
-          <w:rStyle w:val="VerbatimChar"/>
-          <w:rFonts w:hint="eastAsia"/>
-        </w:rPr>
-        <w:t xml:space="preserve">拉霸王</w:t>
-      </w:r>
-      <w:r>
-        <w:rPr>
-          <w:rStyle w:val="VerbatimChar"/>
-        </w:rPr>
-        <w:t xml:space="preserve"> | user01 | 1000 | bet | 14:30 | ✅ |       |  |</w:t>
-      </w:r>
-      <w:r>
-        <w:br/>
-      </w:r>
-      <w:r>
-        <w:rPr>
-          <w:rStyle w:val="VerbatimChar"/>
-        </w:rPr>
-        <w:t xml:space="preserve">|  | 2 | </w:t>
-      </w:r>
-      <w:r>
-        <w:rPr>
-          <w:rStyle w:val="VerbatimChar"/>
-          <w:rFonts w:hint="eastAsia"/>
-        </w:rPr>
-        <w:t xml:space="preserve">機台A-02</w:t>
-      </w:r>
-      <w:r>
-        <w:rPr>
-          <w:rStyle w:val="VerbatimChar"/>
-        </w:rPr>
-        <w:t xml:space="preserve"> | </w:t>
-      </w:r>
-      <w:r>
-        <w:rPr>
-          <w:rStyle w:val="VerbatimChar"/>
-          <w:rFonts w:hint="eastAsia"/>
-        </w:rPr>
-        <w:t xml:space="preserve">百家樂</w:t>
-      </w:r>
-      <w:r>
-        <w:rPr>
-          <w:rStyle w:val="VerbatimChar"/>
-        </w:rPr>
-        <w:t xml:space="preserve"> | user02 | 5000 | bet | 14:28 | ✅ |       |  |</w:t>
-      </w:r>
-      <w:r>
-        <w:br/>
-      </w:r>
-      <w:r>
-        <w:rPr>
-          <w:rStyle w:val="VerbatimChar"/>
-        </w:rPr>
-        <w:t xml:space="preserve">|  | 3 | </w:t>
-      </w:r>
-      <w:r>
-        <w:rPr>
-          <w:rStyle w:val="VerbatimChar"/>
-          <w:rFonts w:hint="eastAsia"/>
-        </w:rPr>
-        <w:t xml:space="preserve">機台A-01</w:t>
-      </w:r>
-      <w:r>
-        <w:rPr>
-          <w:rStyle w:val="VerbatimChar"/>
-        </w:rPr>
-        <w:t xml:space="preserve"> | </w:t>
-      </w:r>
-      <w:r>
-        <w:rPr>
-          <w:rStyle w:val="VerbatimChar"/>
-          <w:rFonts w:hint="eastAsia"/>
-        </w:rPr>
-        <w:t xml:space="preserve">拉霸王</w:t>
-      </w:r>
-      <w:r>
-        <w:rPr>
-          <w:rStyle w:val="VerbatimChar"/>
-        </w:rPr>
-        <w:t xml:space="preserve"> | user01 | 2500 | </w:t>
-      </w:r>
-      <w:r>
-        <w:rPr>
-          <w:rStyle w:val="VerbatimChar"/>
-          <w:rFonts w:hint="eastAsia"/>
-        </w:rPr>
-        <w:t xml:space="preserve">派彩|</w:t>
-      </w:r>
-      <w:r>
-        <w:rPr>
-          <w:rStyle w:val="VerbatimChar"/>
-        </w:rPr>
-        <w:t xml:space="preserve"> 14:25 | ✅ |       |  |</w:t>
-      </w:r>
-      <w:r>
-        <w:br/>
-      </w:r>
-      <w:r>
-        <w:rPr>
-          <w:rStyle w:val="VerbatimChar"/>
-        </w:rPr>
-        <w:t xml:space="preserve">|  +----------------------------------------------------------------+  |</w:t>
-      </w:r>
-      <w:r>
-        <w:br/>
-      </w:r>
-      <w:r>
-        <w:rPr>
-          <w:rStyle w:val="VerbatimChar"/>
-        </w:rPr>
-        <w:t xml:space="preserve">|  | 〈 </w:t>
-      </w:r>
-      <w:r>
-        <w:rPr>
-          <w:rStyle w:val="VerbatimChar"/>
-          <w:rFonts w:hint="eastAsia"/>
-        </w:rPr>
-        <w:t xml:space="preserve">上一頁</w:t>
-      </w:r>
-      <w:r>
-        <w:rPr>
-          <w:rStyle w:val="VerbatimChar"/>
-        </w:rPr>
-        <w:t xml:space="preserve"> 1/50 </w:t>
-      </w:r>
-      <w:r>
-        <w:rPr>
-          <w:rStyle w:val="VerbatimChar"/>
-          <w:rFonts w:hint="eastAsia"/>
-        </w:rPr>
-        <w:t xml:space="preserve">下一頁</w:t>
-      </w:r>
-      <w:r>
-        <w:rPr>
-          <w:rStyle w:val="VerbatimChar"/>
-        </w:rPr>
-        <w:t xml:space="preserve"> 〉                          </w:t>
-      </w:r>
-      <w:r>
-        <w:rPr>
-          <w:rStyle w:val="VerbatimChar"/>
-          <w:rFonts w:hint="eastAsia"/>
-        </w:rPr>
-        <w:t xml:space="preserve">顯示</w:t>
-      </w:r>
-      <w:r>
-        <w:rPr>
-          <w:rStyle w:val="VerbatimChar"/>
-        </w:rPr>
-        <w:t xml:space="preserve"> 20/100   |  |</w:t>
-      </w:r>
-      <w:r>
-        <w:br/>
-      </w:r>
-      <w:r>
-        <w:rPr>
-          <w:rStyle w:val="VerbatimChar"/>
-        </w:rPr>
-        <w:t xml:space="preserve">|  +----------------------------------------------------------------+  |</w:t>
-      </w:r>
-      <w:r>
-        <w:br/>
-      </w:r>
-      <w:r>
-        <w:rPr>
-          <w:rStyle w:val="VerbatimChar"/>
-        </w:rPr>
-        <w:t xml:space="preserve">|                                                                      |</w:t>
-      </w:r>
-      <w:r>
-        <w:br/>
-      </w:r>
-      <w:r>
-        <w:rPr>
-          <w:rStyle w:val="VerbatimChar"/>
-        </w:rPr>
-        <w:t xml:space="preserve">+======================================================================+</w:t>
-      </w:r>
-    </w:p>
-    <w:bookmarkEnd w:id="25"/>
-    <w:bookmarkStart w:id="26" w:name="畫面-3-機台管理列表"/>
+        <w:pStyle w:val="CaptionedFigure"/>
+      </w:pPr>
+      <w:r>
+        <w:drawing>
+          <wp:inline>
+            <wp:extent cx="5334000" cy="3333750"/>
+            <wp:effectExtent b="0" l="0" r="0" t="0"/>
+            <wp:docPr descr="數據清單系統交易總表" title="" id="29" name="Picture"/>
+            <a:graphic>
+              <a:graphicData uri="http://schemas.openxmlformats.org/drawingml/2006/picture">
+                <pic:pic>
+                  <pic:nvPicPr>
+                    <pic:cNvPr descr="../assets/mockup_mvp_data_list.png" id="30" name="Picture"/>
+                    <pic:cNvPicPr>
+                      <a:picLocks noChangeArrowheads="1" noChangeAspect="1"/>
+                    </pic:cNvPicPr>
+                  </pic:nvPicPr>
+                  <pic:blipFill>
+                    <a:blip r:embed="rId28"/>
+                    <a:stretch>
+                      <a:fillRect/>
+                    </a:stretch>
+                  </pic:blipFill>
+                  <pic:spPr bwMode="auto">
+                    <a:xfrm>
+                      <a:off x="0" y="0"/>
+                      <a:ext cx="5334000" cy="3333750"/>
+                    </a:xfrm>
+                    <a:prstGeom prst="rect">
+                      <a:avLst/>
+                    </a:prstGeom>
+                    <a:noFill/>
+                    <a:ln w="9525">
+                      <a:noFill/>
+                      <a:headEnd/>
+                      <a:tailEnd/>
+                    </a:ln>
+                  </pic:spPr>
+                </pic:pic>
+              </a:graphicData>
+            </a:graphic>
+          </wp:inline>
+        </w:drawing>
+      </w:r>
+    </w:p>
+    <w:p>
+      <w:pPr>
+        <w:pStyle w:val="ImageCaption"/>
+      </w:pPr>
+      <w:r>
+        <w:rPr>
+          <w:rFonts w:hint="eastAsia"/>
+        </w:rPr>
+        <w:t xml:space="preserve">數據清單系統交易總表</w:t>
+      </w:r>
+    </w:p>
+    <w:bookmarkEnd w:id="31"/>
+    <w:bookmarkStart w:id="35" w:name="畫面-3-機台管理列表"/>
     <w:p>
       <w:pPr>
         <w:pStyle w:val="Heading4"/>
@@ -3100,551 +2341,64 @@
     </w:p>
     <w:p>
       <w:pPr>
-        <w:pStyle w:val="SourceCode"/>
-      </w:pPr>
-      <w:r>
-        <w:rPr>
-          <w:rStyle w:val="VerbatimChar"/>
-        </w:rPr>
-        <w:t xml:space="preserve">+======================================================================+</w:t>
-      </w:r>
-      <w:r>
-        <w:br/>
-      </w:r>
-      <w:r>
-        <w:rPr>
-          <w:rStyle w:val="VerbatimChar"/>
-        </w:rPr>
-        <w:t xml:space="preserve">|  </w:t>
-      </w:r>
-      <w:r>
-        <w:rPr>
-          <w:rStyle w:val="VerbatimChar"/>
-          <w:rFonts w:hint="eastAsia"/>
-        </w:rPr>
-        <w:t xml:space="preserve">[系統LOGO]</w:t>
-      </w:r>
-      <w:r>
-        <w:rPr>
-          <w:rStyle w:val="VerbatimChar"/>
-        </w:rPr>
-        <w:t xml:space="preserve">    </w:t>
-      </w:r>
-      <w:r>
-        <w:rPr>
-          <w:rStyle w:val="VerbatimChar"/>
-          <w:rFonts w:hint="eastAsia"/>
-        </w:rPr>
-        <w:t xml:space="preserve">[機台管理]</w:t>
-      </w:r>
-      <w:r>
-        <w:rPr>
-          <w:rStyle w:val="VerbatimChar"/>
-        </w:rPr>
-        <w:t xml:space="preserve"> </w:t>
-      </w:r>
-      <w:r>
-        <w:rPr>
-          <w:rStyle w:val="VerbatimChar"/>
-          <w:rFonts w:hint="eastAsia"/>
-        </w:rPr>
-        <w:t xml:space="preserve">[遊戲管理]</w:t>
-      </w:r>
-      <w:r>
-        <w:rPr>
-          <w:rStyle w:val="VerbatimChar"/>
-        </w:rPr>
-        <w:t xml:space="preserve"> </w:t>
-      </w:r>
-      <w:r>
-        <w:rPr>
-          <w:rStyle w:val="VerbatimChar"/>
-          <w:rFonts w:hint="eastAsia"/>
-        </w:rPr>
-        <w:t xml:space="preserve">[玩家管理]</w:t>
-      </w:r>
-      <w:r>
-        <w:rPr>
-          <w:rStyle w:val="VerbatimChar"/>
-        </w:rPr>
-        <w:t xml:space="preserve"> </w:t>
-      </w:r>
-      <w:r>
-        <w:rPr>
-          <w:rStyle w:val="VerbatimChar"/>
-          <w:rFonts w:hint="eastAsia"/>
-        </w:rPr>
-        <w:t xml:space="preserve">[交易]</w:t>
-      </w:r>
-      <w:r>
-        <w:rPr>
-          <w:rStyle w:val="VerbatimChar"/>
-        </w:rPr>
-        <w:t xml:space="preserve"> </w:t>
-      </w:r>
-      <w:r>
-        <w:rPr>
-          <w:rStyle w:val="VerbatimChar"/>
-          <w:rFonts w:hint="eastAsia"/>
-        </w:rPr>
-        <w:t xml:space="preserve">[權限]</w:t>
-      </w:r>
-      <w:r>
-        <w:rPr>
-          <w:rStyle w:val="VerbatimChar"/>
-        </w:rPr>
-        <w:t xml:space="preserve"> </w:t>
-      </w:r>
-      <w:r>
-        <w:rPr>
-          <w:rStyle w:val="VerbatimChar"/>
-          <w:rFonts w:hint="eastAsia"/>
-        </w:rPr>
-        <w:t xml:space="preserve">[登出]</w:t>
-      </w:r>
-      <w:r>
-        <w:rPr>
-          <w:rStyle w:val="VerbatimChar"/>
-        </w:rPr>
-        <w:t xml:space="preserve"> |</w:t>
-      </w:r>
-      <w:r>
-        <w:br/>
-      </w:r>
-      <w:r>
-        <w:rPr>
-          <w:rStyle w:val="VerbatimChar"/>
-        </w:rPr>
-        <w:t xml:space="preserve">+======================================================================+</w:t>
-      </w:r>
-      <w:r>
-        <w:br/>
-      </w:r>
-      <w:r>
-        <w:rPr>
-          <w:rStyle w:val="VerbatimChar"/>
-        </w:rPr>
-        <w:t xml:space="preserve">|                                                                      |</w:t>
-      </w:r>
-      <w:r>
-        <w:br/>
-      </w:r>
-      <w:r>
-        <w:rPr>
-          <w:rStyle w:val="VerbatimChar"/>
-        </w:rPr>
-        <w:t xml:space="preserve">|  ████ </w:t>
-      </w:r>
-      <w:r>
-        <w:rPr>
-          <w:rStyle w:val="VerbatimChar"/>
-          <w:rFonts w:hint="eastAsia"/>
-        </w:rPr>
-        <w:t xml:space="preserve">機台管理</w:t>
-      </w:r>
-      <w:r>
-        <w:rPr>
-          <w:rStyle w:val="VerbatimChar"/>
-        </w:rPr>
-        <w:t xml:space="preserve"> ████                                                |</w:t>
-      </w:r>
-      <w:r>
-        <w:br/>
-      </w:r>
-      <w:r>
-        <w:rPr>
-          <w:rStyle w:val="VerbatimChar"/>
-        </w:rPr>
-        <w:t xml:space="preserve">|                                                                      |</w:t>
-      </w:r>
-      <w:r>
-        <w:br/>
-      </w:r>
-      <w:r>
-        <w:rPr>
-          <w:rStyle w:val="VerbatimChar"/>
-        </w:rPr>
-        <w:t xml:space="preserve">|  +----------------------------------------------------------------+  |</w:t>
-      </w:r>
-      <w:r>
-        <w:br/>
-      </w:r>
-      <w:r>
-        <w:rPr>
-          <w:rStyle w:val="VerbatimChar"/>
-        </w:rPr>
-        <w:t xml:space="preserve">|  | 🔍 </w:t>
-      </w:r>
-      <w:r>
-        <w:rPr>
-          <w:rStyle w:val="VerbatimChar"/>
-          <w:rFonts w:hint="eastAsia"/>
-        </w:rPr>
-        <w:t xml:space="preserve">搜尋機台...</w:t>
-      </w:r>
-      <w:r>
-        <w:rPr>
-          <w:rStyle w:val="VerbatimChar"/>
-        </w:rPr>
-        <w:t xml:space="preserve">  | </w:t>
-      </w:r>
-      <w:r>
-        <w:rPr>
-          <w:rStyle w:val="VerbatimChar"/>
-          <w:rFonts w:hint="eastAsia"/>
-        </w:rPr>
-        <w:t xml:space="preserve">狀態</w:t>
-      </w:r>
-      <w:r>
-        <w:rPr>
-          <w:rStyle w:val="VerbatimChar"/>
-        </w:rPr>
-        <w:t xml:space="preserve"> ▼ | </w:t>
-      </w:r>
-      <w:r>
-        <w:rPr>
-          <w:rStyle w:val="VerbatimChar"/>
-          <w:rFonts w:hint="eastAsia"/>
-        </w:rPr>
-        <w:t xml:space="preserve">[新增機台]</w:t>
-      </w:r>
-      <w:r>
-        <w:rPr>
-          <w:rStyle w:val="VerbatimChar"/>
-        </w:rPr>
-        <w:t xml:space="preserve"> </w:t>
-      </w:r>
-      <w:r>
-        <w:rPr>
-          <w:rStyle w:val="VerbatimChar"/>
-          <w:rFonts w:hint="eastAsia"/>
-        </w:rPr>
-        <w:t xml:space="preserve">[匯出]</w:t>
-      </w:r>
-      <w:r>
-        <w:rPr>
-          <w:rStyle w:val="VerbatimChar"/>
-        </w:rPr>
-        <w:t xml:space="preserve">                  |  |</w:t>
-      </w:r>
-      <w:r>
-        <w:br/>
-      </w:r>
-      <w:r>
-        <w:rPr>
-          <w:rStyle w:val="VerbatimChar"/>
-        </w:rPr>
-        <w:t xml:space="preserve">|  +----------------------------------------------------------------+  |</w:t>
-      </w:r>
-      <w:r>
-        <w:br/>
-      </w:r>
-      <w:r>
-        <w:rPr>
-          <w:rStyle w:val="VerbatimChar"/>
-        </w:rPr>
-        <w:t xml:space="preserve">|  | # | </w:t>
-      </w:r>
-      <w:r>
-        <w:rPr>
-          <w:rStyle w:val="VerbatimChar"/>
-          <w:rFonts w:hint="eastAsia"/>
-        </w:rPr>
-        <w:t xml:space="preserve">機台編號</w:t>
-      </w:r>
-      <w:r>
-        <w:rPr>
-          <w:rStyle w:val="VerbatimChar"/>
-        </w:rPr>
-        <w:t xml:space="preserve"> | </w:t>
-      </w:r>
-      <w:r>
-        <w:rPr>
-          <w:rStyle w:val="VerbatimChar"/>
-          <w:rFonts w:hint="eastAsia"/>
-        </w:rPr>
-        <w:t xml:space="preserve">機台名稱</w:t>
-      </w:r>
-      <w:r>
-        <w:rPr>
-          <w:rStyle w:val="VerbatimChar"/>
-        </w:rPr>
-        <w:t xml:space="preserve"> | </w:t>
-      </w:r>
-      <w:r>
-        <w:rPr>
-          <w:rStyle w:val="VerbatimChar"/>
-          <w:rFonts w:hint="eastAsia"/>
-        </w:rPr>
-        <w:t xml:space="preserve">位置</w:t>
-      </w:r>
-      <w:r>
-        <w:rPr>
-          <w:rStyle w:val="VerbatimChar"/>
-        </w:rPr>
-        <w:t xml:space="preserve"> | </w:t>
-      </w:r>
-      <w:r>
-        <w:rPr>
-          <w:rStyle w:val="VerbatimChar"/>
-          <w:rFonts w:hint="eastAsia"/>
-        </w:rPr>
-        <w:t xml:space="preserve">狀態</w:t>
-      </w:r>
-      <w:r>
-        <w:rPr>
-          <w:rStyle w:val="VerbatimChar"/>
-        </w:rPr>
-        <w:t xml:space="preserve"> | </w:t>
-      </w:r>
-      <w:r>
-        <w:rPr>
-          <w:rStyle w:val="VerbatimChar"/>
-          <w:rFonts w:hint="eastAsia"/>
-        </w:rPr>
-        <w:t xml:space="preserve">最後同步</w:t>
-      </w:r>
-      <w:r>
-        <w:rPr>
-          <w:rStyle w:val="VerbatimChar"/>
-        </w:rPr>
-        <w:t xml:space="preserve"> | </w:t>
-      </w:r>
-      <w:r>
-        <w:rPr>
-          <w:rStyle w:val="VerbatimChar"/>
-          <w:rFonts w:hint="eastAsia"/>
-        </w:rPr>
-        <w:t xml:space="preserve">操作</w:t>
-      </w:r>
-      <w:r>
-        <w:rPr>
-          <w:rStyle w:val="VerbatimChar"/>
-        </w:rPr>
-        <w:t xml:space="preserve">      |  |</w:t>
-      </w:r>
-      <w:r>
-        <w:br/>
-      </w:r>
-      <w:r>
-        <w:rPr>
-          <w:rStyle w:val="VerbatimChar"/>
-        </w:rPr>
-        <w:t xml:space="preserve">|  |---|----------|---------|------|------|----------|----------|    |</w:t>
-      </w:r>
-      <w:r>
-        <w:br/>
-      </w:r>
-      <w:r>
-        <w:rPr>
-          <w:rStyle w:val="VerbatimChar"/>
-        </w:rPr>
-        <w:t xml:space="preserve">|  | 1 | A-001    | </w:t>
-      </w:r>
-      <w:r>
-        <w:rPr>
-          <w:rStyle w:val="VerbatimChar"/>
-          <w:rFonts w:hint="eastAsia"/>
-        </w:rPr>
-        <w:t xml:space="preserve">旗艦1號</w:t>
-      </w:r>
-      <w:r>
-        <w:rPr>
-          <w:rStyle w:val="VerbatimChar"/>
-        </w:rPr>
-        <w:t xml:space="preserve"> | </w:t>
-      </w:r>
-      <w:r>
-        <w:rPr>
-          <w:rStyle w:val="VerbatimChar"/>
-          <w:rFonts w:hint="eastAsia"/>
-        </w:rPr>
-        <w:t xml:space="preserve">門市A</w:t>
-      </w:r>
-      <w:r>
-        <w:rPr>
-          <w:rStyle w:val="VerbatimChar"/>
-        </w:rPr>
-        <w:t xml:space="preserve"> | </w:t>
-      </w:r>
-      <w:r>
-        <w:rPr>
-          <w:rStyle w:val="VerbatimChar"/>
-          <w:rFonts w:hint="eastAsia"/>
-        </w:rPr>
-        <w:t xml:space="preserve">🟢連線</w:t>
-      </w:r>
-      <w:r>
-        <w:rPr>
-          <w:rStyle w:val="VerbatimChar"/>
-        </w:rPr>
-        <w:t xml:space="preserve"> | 14:30    | </w:t>
-      </w:r>
-      <w:r>
-        <w:rPr>
-          <w:rStyle w:val="VerbatimChar"/>
-          <w:rFonts w:hint="eastAsia"/>
-        </w:rPr>
-        <w:t xml:space="preserve">[詳情]</w:t>
-      </w:r>
-      <w:r>
-        <w:rPr>
-          <w:rStyle w:val="VerbatimChar"/>
-        </w:rPr>
-        <w:t xml:space="preserve">  |  |</w:t>
-      </w:r>
-      <w:r>
-        <w:br/>
-      </w:r>
-      <w:r>
-        <w:rPr>
-          <w:rStyle w:val="VerbatimChar"/>
-        </w:rPr>
-        <w:t xml:space="preserve">|  | 2 | A-002    | </w:t>
-      </w:r>
-      <w:r>
-        <w:rPr>
-          <w:rStyle w:val="VerbatimChar"/>
-          <w:rFonts w:hint="eastAsia"/>
-        </w:rPr>
-        <w:t xml:space="preserve">旗艦2號</w:t>
-      </w:r>
-      <w:r>
-        <w:rPr>
-          <w:rStyle w:val="VerbatimChar"/>
-        </w:rPr>
-        <w:t xml:space="preserve"> | </w:t>
-      </w:r>
-      <w:r>
-        <w:rPr>
-          <w:rStyle w:val="VerbatimChar"/>
-          <w:rFonts w:hint="eastAsia"/>
-        </w:rPr>
-        <w:t xml:space="preserve">門市B</w:t>
-      </w:r>
-      <w:r>
-        <w:rPr>
-          <w:rStyle w:val="VerbatimChar"/>
-        </w:rPr>
-        <w:t xml:space="preserve"> | </w:t>
-      </w:r>
-      <w:r>
-        <w:rPr>
-          <w:rStyle w:val="VerbatimChar"/>
-          <w:rFonts w:hint="eastAsia"/>
-        </w:rPr>
-        <w:t xml:space="preserve">🔴離線</w:t>
-      </w:r>
-      <w:r>
-        <w:rPr>
-          <w:rStyle w:val="VerbatimChar"/>
-        </w:rPr>
-        <w:t xml:space="preserve"> | 10:15    | </w:t>
-      </w:r>
-      <w:r>
-        <w:rPr>
-          <w:rStyle w:val="VerbatimChar"/>
-          <w:rFonts w:hint="eastAsia"/>
-        </w:rPr>
-        <w:t xml:space="preserve">[詳情]</w:t>
-      </w:r>
-      <w:r>
-        <w:rPr>
-          <w:rStyle w:val="VerbatimChar"/>
-        </w:rPr>
-        <w:t xml:space="preserve">  |  |</w:t>
-      </w:r>
-      <w:r>
-        <w:br/>
-      </w:r>
-      <w:r>
-        <w:rPr>
-          <w:rStyle w:val="VerbatimChar"/>
-        </w:rPr>
-        <w:t xml:space="preserve">|  | 3 | A-003    | </w:t>
-      </w:r>
-      <w:r>
-        <w:rPr>
-          <w:rStyle w:val="VerbatimChar"/>
-          <w:rFonts w:hint="eastAsia"/>
-        </w:rPr>
-        <w:t xml:space="preserve">標準1號</w:t>
-      </w:r>
-      <w:r>
-        <w:rPr>
-          <w:rStyle w:val="VerbatimChar"/>
-        </w:rPr>
-        <w:t xml:space="preserve"> | </w:t>
-      </w:r>
-      <w:r>
-        <w:rPr>
-          <w:rStyle w:val="VerbatimChar"/>
-          <w:rFonts w:hint="eastAsia"/>
-        </w:rPr>
-        <w:t xml:space="preserve">門市C</w:t>
-      </w:r>
-      <w:r>
-        <w:rPr>
-          <w:rStyle w:val="VerbatimChar"/>
-        </w:rPr>
-        <w:t xml:space="preserve"> | </w:t>
-      </w:r>
-      <w:r>
-        <w:rPr>
-          <w:rStyle w:val="VerbatimChar"/>
-          <w:rFonts w:hint="eastAsia"/>
-        </w:rPr>
-        <w:t xml:space="preserve">🟢連線</w:t>
-      </w:r>
-      <w:r>
-        <w:rPr>
-          <w:rStyle w:val="VerbatimChar"/>
-        </w:rPr>
-        <w:t xml:space="preserve"> | 14:28    | </w:t>
-      </w:r>
-      <w:r>
-        <w:rPr>
-          <w:rStyle w:val="VerbatimChar"/>
-          <w:rFonts w:hint="eastAsia"/>
-        </w:rPr>
-        <w:t xml:space="preserve">[詳情]</w:t>
-      </w:r>
-      <w:r>
-        <w:rPr>
-          <w:rStyle w:val="VerbatimChar"/>
-        </w:rPr>
-        <w:t xml:space="preserve">  |  |</w:t>
-      </w:r>
-      <w:r>
-        <w:br/>
-      </w:r>
-      <w:r>
-        <w:rPr>
-          <w:rStyle w:val="VerbatimChar"/>
-        </w:rPr>
-        <w:t xml:space="preserve">|  +----------------------------------------------------------------+  |</w:t>
-      </w:r>
-      <w:r>
-        <w:br/>
-      </w:r>
-      <w:r>
-        <w:rPr>
-          <w:rStyle w:val="VerbatimChar"/>
-        </w:rPr>
-        <w:t xml:space="preserve">|                                                                      |</w:t>
-      </w:r>
-      <w:r>
-        <w:br/>
-      </w:r>
-      <w:r>
-        <w:rPr>
-          <w:rStyle w:val="VerbatimChar"/>
-        </w:rPr>
-        <w:t xml:space="preserve">+======================================================================+</w:t>
-      </w:r>
-    </w:p>
-    <w:bookmarkEnd w:id="26"/>
-    <w:bookmarkStart w:id="27" w:name="畫面-4-玩家管理列表"/>
+        <w:pStyle w:val="CaptionedFigure"/>
+      </w:pPr>
+      <w:r>
+        <w:drawing>
+          <wp:inline>
+            <wp:extent cx="5334000" cy="3333750"/>
+            <wp:effectExtent b="0" l="0" r="0" t="0"/>
+            <wp:docPr descr="機台管理列表" title="" id="33" name="Picture"/>
+            <a:graphic>
+              <a:graphicData uri="http://schemas.openxmlformats.org/drawingml/2006/picture">
+                <pic:pic>
+                  <pic:nvPicPr>
+                    <pic:cNvPr descr="../assets/mockup_mvp_machine_list.png" id="34" name="Picture"/>
+                    <pic:cNvPicPr>
+                      <a:picLocks noChangeArrowheads="1" noChangeAspect="1"/>
+                    </pic:cNvPicPr>
+                  </pic:nvPicPr>
+                  <pic:blipFill>
+                    <a:blip r:embed="rId32"/>
+                    <a:stretch>
+                      <a:fillRect/>
+                    </a:stretch>
+                  </pic:blipFill>
+                  <pic:spPr bwMode="auto">
+                    <a:xfrm>
+                      <a:off x="0" y="0"/>
+                      <a:ext cx="5334000" cy="3333750"/>
+                    </a:xfrm>
+                    <a:prstGeom prst="rect">
+                      <a:avLst/>
+                    </a:prstGeom>
+                    <a:noFill/>
+                    <a:ln w="9525">
+                      <a:noFill/>
+                      <a:headEnd/>
+                      <a:tailEnd/>
+                    </a:ln>
+                  </pic:spPr>
+                </pic:pic>
+              </a:graphicData>
+            </a:graphic>
+          </wp:inline>
+        </w:drawing>
+      </w:r>
+    </w:p>
+    <w:p>
+      <w:pPr>
+        <w:pStyle w:val="ImageCaption"/>
+      </w:pPr>
+      <w:r>
+        <w:rPr>
+          <w:rFonts w:hint="eastAsia"/>
+        </w:rPr>
+        <w:t xml:space="preserve">機台管理列表</w:t>
+      </w:r>
+    </w:p>
+    <w:bookmarkEnd w:id="35"/>
+    <w:bookmarkStart w:id="39" w:name="畫面-4-玩家管理列表"/>
     <w:p>
       <w:pPr>
         <w:pStyle w:val="Heading4"/>
@@ -3667,513 +2421,65 @@
     </w:p>
     <w:p>
       <w:pPr>
-        <w:pStyle w:val="SourceCode"/>
-      </w:pPr>
-      <w:r>
-        <w:rPr>
-          <w:rStyle w:val="VerbatimChar"/>
-        </w:rPr>
-        <w:t xml:space="preserve">+======================================================================+</w:t>
-      </w:r>
-      <w:r>
-        <w:br/>
-      </w:r>
-      <w:r>
-        <w:rPr>
-          <w:rStyle w:val="VerbatimChar"/>
-        </w:rPr>
-        <w:t xml:space="preserve">|  </w:t>
-      </w:r>
-      <w:r>
-        <w:rPr>
-          <w:rStyle w:val="VerbatimChar"/>
-          <w:rFonts w:hint="eastAsia"/>
-        </w:rPr>
-        <w:t xml:space="preserve">[系統LOGO]</w:t>
-      </w:r>
-      <w:r>
-        <w:rPr>
-          <w:rStyle w:val="VerbatimChar"/>
-        </w:rPr>
-        <w:t xml:space="preserve">    </w:t>
-      </w:r>
-      <w:r>
-        <w:rPr>
-          <w:rStyle w:val="VerbatimChar"/>
-          <w:rFonts w:hint="eastAsia"/>
-        </w:rPr>
-        <w:t xml:space="preserve">[機台管理]</w:t>
-      </w:r>
-      <w:r>
-        <w:rPr>
-          <w:rStyle w:val="VerbatimChar"/>
-        </w:rPr>
-        <w:t xml:space="preserve"> </w:t>
-      </w:r>
-      <w:r>
-        <w:rPr>
-          <w:rStyle w:val="VerbatimChar"/>
-          <w:rFonts w:hint="eastAsia"/>
-        </w:rPr>
-        <w:t xml:space="preserve">[遊戲管理]</w:t>
-      </w:r>
-      <w:r>
-        <w:rPr>
-          <w:rStyle w:val="VerbatimChar"/>
-        </w:rPr>
-        <w:t xml:space="preserve"> </w:t>
-      </w:r>
-      <w:r>
-        <w:rPr>
-          <w:rStyle w:val="VerbatimChar"/>
-          <w:rFonts w:hint="eastAsia"/>
-        </w:rPr>
-        <w:t xml:space="preserve">[玩家管理]</w:t>
-      </w:r>
-      <w:r>
-        <w:rPr>
-          <w:rStyle w:val="VerbatimChar"/>
-        </w:rPr>
-        <w:t xml:space="preserve"> </w:t>
-      </w:r>
-      <w:r>
-        <w:rPr>
-          <w:rStyle w:val="VerbatimChar"/>
-          <w:rFonts w:hint="eastAsia"/>
-        </w:rPr>
-        <w:t xml:space="preserve">[交易]</w:t>
-      </w:r>
-      <w:r>
-        <w:rPr>
-          <w:rStyle w:val="VerbatimChar"/>
-        </w:rPr>
-        <w:t xml:space="preserve"> </w:t>
-      </w:r>
-      <w:r>
-        <w:rPr>
-          <w:rStyle w:val="VerbatimChar"/>
-          <w:rFonts w:hint="eastAsia"/>
-        </w:rPr>
-        <w:t xml:space="preserve">[權限]</w:t>
-      </w:r>
-      <w:r>
-        <w:rPr>
-          <w:rStyle w:val="VerbatimChar"/>
-        </w:rPr>
-        <w:t xml:space="preserve"> </w:t>
-      </w:r>
-      <w:r>
-        <w:rPr>
-          <w:rStyle w:val="VerbatimChar"/>
-          <w:rFonts w:hint="eastAsia"/>
-        </w:rPr>
-        <w:t xml:space="preserve">[登出]</w:t>
-      </w:r>
-      <w:r>
-        <w:rPr>
-          <w:rStyle w:val="VerbatimChar"/>
-        </w:rPr>
-        <w:t xml:space="preserve"> |</w:t>
-      </w:r>
-      <w:r>
-        <w:br/>
-      </w:r>
-      <w:r>
-        <w:rPr>
-          <w:rStyle w:val="VerbatimChar"/>
-        </w:rPr>
-        <w:t xml:space="preserve">+======================================================================+</w:t>
-      </w:r>
-      <w:r>
-        <w:br/>
-      </w:r>
-      <w:r>
-        <w:rPr>
-          <w:rStyle w:val="VerbatimChar"/>
-        </w:rPr>
-        <w:t xml:space="preserve">|                                                                      |</w:t>
-      </w:r>
-      <w:r>
-        <w:br/>
-      </w:r>
-      <w:r>
-        <w:rPr>
-          <w:rStyle w:val="VerbatimChar"/>
-        </w:rPr>
-        <w:t xml:space="preserve">|  ████ </w:t>
-      </w:r>
-      <w:r>
-        <w:rPr>
-          <w:rStyle w:val="VerbatimChar"/>
-          <w:rFonts w:hint="eastAsia"/>
-        </w:rPr>
-        <w:t xml:space="preserve">玩家管理</w:t>
-      </w:r>
-      <w:r>
-        <w:rPr>
-          <w:rStyle w:val="VerbatimChar"/>
-        </w:rPr>
-        <w:t xml:space="preserve"> ████                                                |</w:t>
-      </w:r>
-      <w:r>
-        <w:br/>
-      </w:r>
-      <w:r>
-        <w:rPr>
-          <w:rStyle w:val="VerbatimChar"/>
-        </w:rPr>
-        <w:t xml:space="preserve">|                                                                      |</w:t>
-      </w:r>
-      <w:r>
-        <w:br/>
-      </w:r>
-      <w:r>
-        <w:rPr>
-          <w:rStyle w:val="VerbatimChar"/>
-        </w:rPr>
-        <w:t xml:space="preserve">|  +----------------------------------------------------------------+  |</w:t>
-      </w:r>
-      <w:r>
-        <w:br/>
-      </w:r>
-      <w:r>
-        <w:rPr>
-          <w:rStyle w:val="VerbatimChar"/>
-        </w:rPr>
-        <w:t xml:space="preserve">|  | 🔍 </w:t>
-      </w:r>
-      <w:r>
-        <w:rPr>
-          <w:rStyle w:val="VerbatimChar"/>
-          <w:rFonts w:hint="eastAsia"/>
-        </w:rPr>
-        <w:t xml:space="preserve">搜尋玩家...</w:t>
-      </w:r>
-      <w:r>
-        <w:rPr>
-          <w:rStyle w:val="VerbatimChar"/>
-        </w:rPr>
-        <w:t xml:space="preserve">  | </w:t>
-      </w:r>
-      <w:r>
-        <w:rPr>
-          <w:rStyle w:val="VerbatimChar"/>
-          <w:rFonts w:hint="eastAsia"/>
-        </w:rPr>
-        <w:t xml:space="preserve">狀態</w:t>
-      </w:r>
-      <w:r>
-        <w:rPr>
-          <w:rStyle w:val="VerbatimChar"/>
-        </w:rPr>
-        <w:t xml:space="preserve"> ▼ | </w:t>
-      </w:r>
-      <w:r>
-        <w:rPr>
-          <w:rStyle w:val="VerbatimChar"/>
-          <w:rFonts w:hint="eastAsia"/>
-        </w:rPr>
-        <w:t xml:space="preserve">[新增玩家]</w:t>
-      </w:r>
-      <w:r>
-        <w:rPr>
-          <w:rStyle w:val="VerbatimChar"/>
-        </w:rPr>
-        <w:t xml:space="preserve"> </w:t>
-      </w:r>
-      <w:r>
-        <w:rPr>
-          <w:rStyle w:val="VerbatimChar"/>
-          <w:rFonts w:hint="eastAsia"/>
-        </w:rPr>
-        <w:t xml:space="preserve">[匯出]</w:t>
-      </w:r>
-      <w:r>
-        <w:rPr>
-          <w:rStyle w:val="VerbatimChar"/>
-        </w:rPr>
-        <w:t xml:space="preserve">                  |  |</w:t>
-      </w:r>
-      <w:r>
-        <w:br/>
-      </w:r>
-      <w:r>
-        <w:rPr>
-          <w:rStyle w:val="VerbatimChar"/>
-        </w:rPr>
-        <w:t xml:space="preserve">|  +----------------------------------------------------------------+  |</w:t>
-      </w:r>
-      <w:r>
-        <w:br/>
-      </w:r>
-      <w:r>
-        <w:rPr>
-          <w:rStyle w:val="VerbatimChar"/>
-        </w:rPr>
-        <w:t xml:space="preserve">|  | # | </w:t>
-      </w:r>
-      <w:r>
-        <w:rPr>
-          <w:rStyle w:val="VerbatimChar"/>
-          <w:rFonts w:hint="eastAsia"/>
-        </w:rPr>
-        <w:t xml:space="preserve">帳號</w:t>
-      </w:r>
-      <w:r>
-        <w:rPr>
-          <w:rStyle w:val="VerbatimChar"/>
-        </w:rPr>
-        <w:t xml:space="preserve"> | </w:t>
-      </w:r>
-      <w:r>
-        <w:rPr>
-          <w:rStyle w:val="VerbatimChar"/>
-          <w:rFonts w:hint="eastAsia"/>
-        </w:rPr>
-        <w:t xml:space="preserve">暱稱</w:t>
-      </w:r>
-      <w:r>
-        <w:rPr>
-          <w:rStyle w:val="VerbatimChar"/>
-        </w:rPr>
-        <w:t xml:space="preserve"> | </w:t>
-      </w:r>
-      <w:r>
-        <w:rPr>
-          <w:rStyle w:val="VerbatimChar"/>
-          <w:rFonts w:hint="eastAsia"/>
-        </w:rPr>
-        <w:t xml:space="preserve">餘額</w:t>
-      </w:r>
-      <w:r>
-        <w:rPr>
-          <w:rStyle w:val="VerbatimChar"/>
-        </w:rPr>
-        <w:t xml:space="preserve"> | </w:t>
-      </w:r>
-      <w:r>
-        <w:rPr>
-          <w:rStyle w:val="VerbatimChar"/>
-          <w:rFonts w:hint="eastAsia"/>
-        </w:rPr>
-        <w:t xml:space="preserve">狀態</w:t>
-      </w:r>
-      <w:r>
-        <w:rPr>
-          <w:rStyle w:val="VerbatimChar"/>
-        </w:rPr>
-        <w:t xml:space="preserve"> | </w:t>
-      </w:r>
-      <w:r>
-        <w:rPr>
-          <w:rStyle w:val="VerbatimChar"/>
-          <w:rFonts w:hint="eastAsia"/>
-        </w:rPr>
-        <w:t xml:space="preserve">註冊時間</w:t>
-      </w:r>
-      <w:r>
-        <w:rPr>
-          <w:rStyle w:val="VerbatimChar"/>
-        </w:rPr>
-        <w:t xml:space="preserve"> | </w:t>
-      </w:r>
-      <w:r>
-        <w:rPr>
-          <w:rStyle w:val="VerbatimChar"/>
-          <w:rFonts w:hint="eastAsia"/>
-        </w:rPr>
-        <w:t xml:space="preserve">操作</w:t>
-      </w:r>
-      <w:r>
-        <w:rPr>
-          <w:rStyle w:val="VerbatimChar"/>
-        </w:rPr>
-        <w:t xml:space="preserve">               |  |</w:t>
-      </w:r>
-      <w:r>
-        <w:br/>
-      </w:r>
-      <w:r>
-        <w:rPr>
-          <w:rStyle w:val="VerbatimChar"/>
-        </w:rPr>
-        <w:t xml:space="preserve">|  |---|------|------|------|------|----------|-------------------|    |</w:t>
-      </w:r>
-      <w:r>
-        <w:br/>
-      </w:r>
-      <w:r>
-        <w:rPr>
-          <w:rStyle w:val="VerbatimChar"/>
-        </w:rPr>
-        <w:t xml:space="preserve">|  | 1 | user01 | </w:t>
-      </w:r>
-      <w:r>
-        <w:rPr>
-          <w:rStyle w:val="VerbatimChar"/>
-          <w:rFonts w:hint="eastAsia"/>
-        </w:rPr>
-        <w:t xml:space="preserve">玩家小明</w:t>
-      </w:r>
-      <w:r>
-        <w:rPr>
-          <w:rStyle w:val="VerbatimChar"/>
-        </w:rPr>
-        <w:t xml:space="preserve"> | $5,000 | </w:t>
-      </w:r>
-      <w:r>
-        <w:rPr>
-          <w:rStyle w:val="VerbatimChar"/>
-          <w:rFonts w:hint="eastAsia"/>
-        </w:rPr>
-        <w:t xml:space="preserve">正常</w:t>
-      </w:r>
-      <w:r>
-        <w:rPr>
-          <w:rStyle w:val="VerbatimChar"/>
-        </w:rPr>
-        <w:t xml:space="preserve"> | 2026/01/15 | </w:t>
-      </w:r>
-      <w:r>
-        <w:rPr>
-          <w:rStyle w:val="VerbatimChar"/>
-          <w:rFonts w:hint="eastAsia"/>
-        </w:rPr>
-        <w:t xml:space="preserve">[詳情]</w:t>
-      </w:r>
-      <w:r>
-        <w:rPr>
-          <w:rStyle w:val="VerbatimChar"/>
-        </w:rPr>
-        <w:t xml:space="preserve"> |  |</w:t>
-      </w:r>
-      <w:r>
-        <w:br/>
-      </w:r>
-      <w:r>
-        <w:rPr>
-          <w:rStyle w:val="VerbatimChar"/>
-        </w:rPr>
-        <w:t xml:space="preserve">|  | 2 | user02 | </w:t>
-      </w:r>
-      <w:r>
-        <w:rPr>
-          <w:rStyle w:val="VerbatimChar"/>
-          <w:rFonts w:hint="eastAsia"/>
-        </w:rPr>
-        <w:t xml:space="preserve">玩家大華</w:t>
-      </w:r>
-      <w:r>
-        <w:rPr>
-          <w:rStyle w:val="VerbatimChar"/>
-        </w:rPr>
-        <w:t xml:space="preserve"> | $12,500 | </w:t>
-      </w:r>
-      <w:r>
-        <w:rPr>
-          <w:rStyle w:val="VerbatimChar"/>
-          <w:rFonts w:hint="eastAsia"/>
-        </w:rPr>
-        <w:t xml:space="preserve">正常</w:t>
-      </w:r>
-      <w:r>
-        <w:rPr>
-          <w:rStyle w:val="VerbatimChar"/>
-        </w:rPr>
-        <w:t xml:space="preserve"> | 2026/01/20 | </w:t>
-      </w:r>
-      <w:r>
-        <w:rPr>
-          <w:rStyle w:val="VerbatimChar"/>
-          <w:rFonts w:hint="eastAsia"/>
-        </w:rPr>
-        <w:t xml:space="preserve">[詳情]</w:t>
-      </w:r>
-      <w:r>
-        <w:rPr>
-          <w:rStyle w:val="VerbatimChar"/>
-        </w:rPr>
-        <w:t xml:space="preserve"> |  |</w:t>
-      </w:r>
-      <w:r>
-        <w:br/>
-      </w:r>
-      <w:r>
-        <w:rPr>
-          <w:rStyle w:val="VerbatimChar"/>
-        </w:rPr>
-        <w:t xml:space="preserve">|  | 3 | user03 | </w:t>
-      </w:r>
-      <w:r>
-        <w:rPr>
-          <w:rStyle w:val="VerbatimChar"/>
-          <w:rFonts w:hint="eastAsia"/>
-        </w:rPr>
-        <w:t xml:space="preserve">玩家小美</w:t>
-      </w:r>
-      <w:r>
-        <w:rPr>
-          <w:rStyle w:val="VerbatimChar"/>
-        </w:rPr>
-        <w:t xml:space="preserve"> | $0 | </w:t>
-      </w:r>
-      <w:r>
-        <w:rPr>
-          <w:rStyle w:val="VerbatimChar"/>
-          <w:rFonts w:hint="eastAsia"/>
-        </w:rPr>
-        <w:t xml:space="preserve">停權</w:t>
-      </w:r>
-      <w:r>
-        <w:rPr>
-          <w:rStyle w:val="VerbatimChar"/>
-        </w:rPr>
-        <w:t xml:space="preserve"> | 2026/02/01 | </w:t>
-      </w:r>
-      <w:r>
-        <w:rPr>
-          <w:rStyle w:val="VerbatimChar"/>
-          <w:rFonts w:hint="eastAsia"/>
-        </w:rPr>
-        <w:t xml:space="preserve">[詳情]</w:t>
-      </w:r>
-      <w:r>
-        <w:rPr>
-          <w:rStyle w:val="VerbatimChar"/>
-        </w:rPr>
-        <w:t xml:space="preserve"> |  |</w:t>
-      </w:r>
-      <w:r>
-        <w:br/>
-      </w:r>
-      <w:r>
-        <w:rPr>
-          <w:rStyle w:val="VerbatimChar"/>
-        </w:rPr>
-        <w:t xml:space="preserve">|  +----------------------------------------------------------------+  |</w:t>
-      </w:r>
-      <w:r>
-        <w:br/>
-      </w:r>
-      <w:r>
-        <w:rPr>
-          <w:rStyle w:val="VerbatimChar"/>
-        </w:rPr>
-        <w:t xml:space="preserve">|                                                                      |</w:t>
-      </w:r>
-      <w:r>
-        <w:br/>
-      </w:r>
-      <w:r>
-        <w:rPr>
-          <w:rStyle w:val="VerbatimChar"/>
-        </w:rPr>
-        <w:t xml:space="preserve">+======================================================================+</w:t>
-      </w:r>
-    </w:p>
-    <w:bookmarkEnd w:id="27"/>
-    <w:bookmarkEnd w:id="28"/>
-    <w:bookmarkStart w:id="31" w:name="單機本地後台-local-backend"/>
+        <w:pStyle w:val="CaptionedFigure"/>
+      </w:pPr>
+      <w:r>
+        <w:drawing>
+          <wp:inline>
+            <wp:extent cx="5334000" cy="3333750"/>
+            <wp:effectExtent b="0" l="0" r="0" t="0"/>
+            <wp:docPr descr="玩家管理列表" title="" id="37" name="Picture"/>
+            <a:graphic>
+              <a:graphicData uri="http://schemas.openxmlformats.org/drawingml/2006/picture">
+                <pic:pic>
+                  <pic:nvPicPr>
+                    <pic:cNvPr descr="../assets/mockup_mvp_player_list.png" id="38" name="Picture"/>
+                    <pic:cNvPicPr>
+                      <a:picLocks noChangeArrowheads="1" noChangeAspect="1"/>
+                    </pic:cNvPicPr>
+                  </pic:nvPicPr>
+                  <pic:blipFill>
+                    <a:blip r:embed="rId36"/>
+                    <a:stretch>
+                      <a:fillRect/>
+                    </a:stretch>
+                  </pic:blipFill>
+                  <pic:spPr bwMode="auto">
+                    <a:xfrm>
+                      <a:off x="0" y="0"/>
+                      <a:ext cx="5334000" cy="3333750"/>
+                    </a:xfrm>
+                    <a:prstGeom prst="rect">
+                      <a:avLst/>
+                    </a:prstGeom>
+                    <a:noFill/>
+                    <a:ln w="9525">
+                      <a:noFill/>
+                      <a:headEnd/>
+                      <a:tailEnd/>
+                    </a:ln>
+                  </pic:spPr>
+                </pic:pic>
+              </a:graphicData>
+            </a:graphic>
+          </wp:inline>
+        </w:drawing>
+      </w:r>
+    </w:p>
+    <w:p>
+      <w:pPr>
+        <w:pStyle w:val="ImageCaption"/>
+      </w:pPr>
+      <w:r>
+        <w:rPr>
+          <w:rFonts w:hint="eastAsia"/>
+        </w:rPr>
+        <w:t xml:space="preserve">玩家管理列表</w:t>
+      </w:r>
+    </w:p>
+    <w:bookmarkEnd w:id="39"/>
+    <w:bookmarkEnd w:id="40"/>
+    <w:bookmarkStart w:id="49" w:name="單機本地後台-local-backend"/>
     <w:p>
       <w:pPr>
         <w:pStyle w:val="Heading3"/>
@@ -4191,7 +2497,7 @@
         <w:t xml:space="preserve"> (Local Backend)</w:t>
       </w:r>
     </w:p>
-    <w:bookmarkStart w:id="29" w:name="畫面-1-安全的開洗分介面"/>
+    <w:bookmarkStart w:id="44" w:name="畫面-1-安全的開洗分介面"/>
     <w:p>
       <w:pPr>
         <w:pStyle w:val="Heading4"/>
@@ -4214,511 +2520,64 @@
     </w:p>
     <w:p>
       <w:pPr>
-        <w:pStyle w:val="SourceCode"/>
-      </w:pPr>
-      <w:r>
-        <w:rPr>
-          <w:rStyle w:val="VerbatimChar"/>
-        </w:rPr>
-        <w:t xml:space="preserve">+======================================================================+</w:t>
-      </w:r>
-      <w:r>
-        <w:br/>
-      </w:r>
-      <w:r>
-        <w:rPr>
-          <w:rStyle w:val="VerbatimChar"/>
-        </w:rPr>
-        <w:t xml:space="preserve">|  </w:t>
-      </w:r>
-      <w:r>
-        <w:rPr>
-          <w:rStyle w:val="VerbatimChar"/>
-          <w:rFonts w:hint="eastAsia"/>
-        </w:rPr>
-        <w:t xml:space="preserve">[本機設定]</w:t>
-      </w:r>
-      <w:r>
-        <w:rPr>
-          <w:rStyle w:val="VerbatimChar"/>
-        </w:rPr>
-        <w:t xml:space="preserve">    </w:t>
-      </w:r>
-      <w:r>
-        <w:rPr>
-          <w:rStyle w:val="VerbatimChar"/>
-          <w:rFonts w:hint="eastAsia"/>
-        </w:rPr>
-        <w:t xml:space="preserve">機台名稱:</w:t>
-      </w:r>
-      <w:r>
-        <w:rPr>
-          <w:rStyle w:val="VerbatimChar"/>
-        </w:rPr>
-        <w:t xml:space="preserve"> A-01    </w:t>
-      </w:r>
-      <w:r>
-        <w:rPr>
-          <w:rStyle w:val="VerbatimChar"/>
-          <w:rFonts w:hint="eastAsia"/>
-        </w:rPr>
-        <w:t xml:space="preserve">狀態:</w:t>
-      </w:r>
-      <w:r>
-        <w:rPr>
-          <w:rStyle w:val="VerbatimChar"/>
-        </w:rPr>
-        <w:t xml:space="preserve"> 🟢 </w:t>
-      </w:r>
-      <w:r>
-        <w:rPr>
-          <w:rStyle w:val="VerbatimChar"/>
-          <w:rFonts w:hint="eastAsia"/>
-        </w:rPr>
-        <w:t xml:space="preserve">連線中</w:t>
-      </w:r>
-      <w:r>
-        <w:rPr>
-          <w:rStyle w:val="VerbatimChar"/>
-        </w:rPr>
-        <w:t xml:space="preserve">    </w:t>
-      </w:r>
-      <w:r>
-        <w:rPr>
-          <w:rStyle w:val="VerbatimChar"/>
-          <w:rFonts w:hint="eastAsia"/>
-        </w:rPr>
-        <w:t xml:space="preserve">[登出]</w:t>
-      </w:r>
-      <w:r>
-        <w:rPr>
-          <w:rStyle w:val="VerbatimChar"/>
-        </w:rPr>
-        <w:t xml:space="preserve">          |</w:t>
-      </w:r>
-      <w:r>
-        <w:br/>
-      </w:r>
-      <w:r>
-        <w:rPr>
-          <w:rStyle w:val="VerbatimChar"/>
-        </w:rPr>
-        <w:t xml:space="preserve">+======================================================================+</w:t>
-      </w:r>
-      <w:r>
-        <w:br/>
-      </w:r>
-      <w:r>
-        <w:rPr>
-          <w:rStyle w:val="VerbatimChar"/>
-        </w:rPr>
-        <w:t xml:space="preserve">|                                                                      |</w:t>
-      </w:r>
-      <w:r>
-        <w:br/>
-      </w:r>
-      <w:r>
-        <w:rPr>
-          <w:rStyle w:val="VerbatimChar"/>
-        </w:rPr>
-        <w:t xml:space="preserve">|  ████ </w:t>
-      </w:r>
-      <w:r>
-        <w:rPr>
-          <w:rStyle w:val="VerbatimChar"/>
-          <w:rFonts w:hint="eastAsia"/>
-        </w:rPr>
-        <w:t xml:space="preserve">本日營收</w:t>
-      </w:r>
-      <w:r>
-        <w:rPr>
-          <w:rStyle w:val="VerbatimChar"/>
-        </w:rPr>
-        <w:t xml:space="preserve"> ████                                                   |</w:t>
-      </w:r>
-      <w:r>
-        <w:br/>
-      </w:r>
-      <w:r>
-        <w:rPr>
-          <w:rStyle w:val="VerbatimChar"/>
-        </w:rPr>
-        <w:t xml:space="preserve">|  +--------------------------------------------------------------+   |</w:t>
-      </w:r>
-      <w:r>
-        <w:br/>
-      </w:r>
-      <w:r>
-        <w:rPr>
-          <w:rStyle w:val="VerbatimChar"/>
-        </w:rPr>
-        <w:t xml:space="preserve">|  |  </w:t>
-      </w:r>
-      <w:r>
-        <w:rPr>
-          <w:rStyle w:val="VerbatimChar"/>
-          <w:rFonts w:hint="eastAsia"/>
-        </w:rPr>
-        <w:t xml:space="preserve">今日營收</w:t>
-      </w:r>
-      <w:r>
-        <w:rPr>
-          <w:rStyle w:val="VerbatimChar"/>
-        </w:rPr>
-        <w:t xml:space="preserve">  |   </w:t>
-      </w:r>
-      <w:r>
-        <w:rPr>
-          <w:rStyle w:val="VerbatimChar"/>
-          <w:rFonts w:hint="eastAsia"/>
-        </w:rPr>
-        <w:t xml:space="preserve">今日下注</w:t>
-      </w:r>
-      <w:r>
-        <w:rPr>
-          <w:rStyle w:val="VerbatimChar"/>
-        </w:rPr>
-        <w:t xml:space="preserve">   |  </w:t>
-      </w:r>
-      <w:r>
-        <w:rPr>
-          <w:rStyle w:val="VerbatimChar"/>
-          <w:rFonts w:hint="eastAsia"/>
-        </w:rPr>
-        <w:t xml:space="preserve">今日派彩</w:t>
-      </w:r>
-      <w:r>
-        <w:rPr>
-          <w:rStyle w:val="VerbatimChar"/>
-        </w:rPr>
-        <w:t xml:space="preserve">   |   </w:t>
-      </w:r>
-      <w:r>
-        <w:rPr>
-          <w:rStyle w:val="VerbatimChar"/>
-          <w:rFonts w:hint="eastAsia"/>
-        </w:rPr>
-        <w:t xml:space="preserve">淨收益</w:t>
-      </w:r>
-      <w:r>
-        <w:rPr>
-          <w:rStyle w:val="VerbatimChar"/>
-        </w:rPr>
-        <w:t xml:space="preserve">           |   |</w:t>
-      </w:r>
-      <w:r>
-        <w:br/>
-      </w:r>
-      <w:r>
-        <w:rPr>
-          <w:rStyle w:val="VerbatimChar"/>
-        </w:rPr>
-        <w:t xml:space="preserve">|  |  $12,500   |   $45,000    |   $32,500   |   $12,500          |   |</w:t>
-      </w:r>
-      <w:r>
-        <w:br/>
-      </w:r>
-      <w:r>
-        <w:rPr>
-          <w:rStyle w:val="VerbatimChar"/>
-        </w:rPr>
-        <w:t xml:space="preserve">|  +--------------------------------------------------------------+   |</w:t>
-      </w:r>
-      <w:r>
-        <w:br/>
-      </w:r>
-      <w:r>
-        <w:rPr>
-          <w:rStyle w:val="VerbatimChar"/>
-        </w:rPr>
-        <w:t xml:space="preserve">|                                                                      |</w:t>
-      </w:r>
-      <w:r>
-        <w:br/>
-      </w:r>
-      <w:r>
-        <w:rPr>
-          <w:rStyle w:val="VerbatimChar"/>
-        </w:rPr>
-        <w:t xml:space="preserve">|  ████ </w:t>
-      </w:r>
-      <w:r>
-        <w:rPr>
-          <w:rStyle w:val="VerbatimChar"/>
-          <w:rFonts w:hint="eastAsia"/>
-        </w:rPr>
-        <w:t xml:space="preserve">快速操作</w:t>
-      </w:r>
-      <w:r>
-        <w:rPr>
-          <w:rStyle w:val="VerbatimChar"/>
-        </w:rPr>
-        <w:t xml:space="preserve"> ████                                                   |</w:t>
-      </w:r>
-      <w:r>
-        <w:br/>
-      </w:r>
-      <w:r>
-        <w:rPr>
-          <w:rStyle w:val="VerbatimChar"/>
-        </w:rPr>
-        <w:t xml:space="preserve">|                                                                      |</w:t>
-      </w:r>
-      <w:r>
-        <w:br/>
-      </w:r>
-      <w:r>
-        <w:rPr>
-          <w:rStyle w:val="VerbatimChar"/>
-        </w:rPr>
-        <w:t xml:space="preserve">|     +------------------+      +------------------+                  |</w:t>
-      </w:r>
-      <w:r>
-        <w:br/>
-      </w:r>
-      <w:r>
-        <w:rPr>
-          <w:rStyle w:val="VerbatimChar"/>
-        </w:rPr>
-        <w:t xml:space="preserve">|     |    </w:t>
-      </w:r>
-      <w:r>
-        <w:rPr>
-          <w:rStyle w:val="VerbatimChar"/>
-          <w:rFonts w:hint="eastAsia"/>
-        </w:rPr>
-        <w:t xml:space="preserve">[輸入PIN碼]</w:t>
-      </w:r>
-      <w:r>
-        <w:rPr>
-          <w:rStyle w:val="VerbatimChar"/>
-        </w:rPr>
-        <w:t xml:space="preserve">    |      |    </w:t>
-      </w:r>
-      <w:r>
-        <w:rPr>
-          <w:rStyle w:val="VerbatimChar"/>
-          <w:rFonts w:hint="eastAsia"/>
-        </w:rPr>
-        <w:t xml:space="preserve">[輸入PIN碼]</w:t>
-      </w:r>
-      <w:r>
-        <w:rPr>
-          <w:rStyle w:val="VerbatimChar"/>
-        </w:rPr>
-        <w:t xml:space="preserve">    |                  |</w:t>
-      </w:r>
-      <w:r>
-        <w:br/>
-      </w:r>
-      <w:r>
-        <w:rPr>
-          <w:rStyle w:val="VerbatimChar"/>
-        </w:rPr>
-        <w:t xml:space="preserve">|     |   ┌──────────┐    |      |   ┌──────────┐    |                  |</w:t>
-      </w:r>
-      <w:r>
-        <w:br/>
-      </w:r>
-      <w:r>
-        <w:rPr>
-          <w:rStyle w:val="VerbatimChar"/>
-        </w:rPr>
-        <w:t xml:space="preserve">|     |   │  ▢ ▢ ▢ ▢ │    |      |   │  ▢ ▢ ▢ ▢ │    |                  |</w:t>
-      </w:r>
-      <w:r>
-        <w:br/>
-      </w:r>
-      <w:r>
-        <w:rPr>
-          <w:rStyle w:val="VerbatimChar"/>
-        </w:rPr>
-        <w:t xml:space="preserve">|     |   └──────────┘    |      |   └──────────┘    |                  |</w:t>
-      </w:r>
-      <w:r>
-        <w:br/>
-      </w:r>
-      <w:r>
-        <w:rPr>
-          <w:rStyle w:val="VerbatimChar"/>
-        </w:rPr>
-        <w:t xml:space="preserve">|     |   ┌──────────┐    |      |   ┌──────────┐    |                  |</w:t>
-      </w:r>
-      <w:r>
-        <w:br/>
-      </w:r>
-      <w:r>
-        <w:rPr>
-          <w:rStyle w:val="VerbatimChar"/>
-        </w:rPr>
-        <w:t xml:space="preserve">|     |   │ $        │    |      |   │ $        │    |                  |</w:t>
-      </w:r>
-      <w:r>
-        <w:br/>
-      </w:r>
-      <w:r>
-        <w:rPr>
-          <w:rStyle w:val="VerbatimChar"/>
-        </w:rPr>
-        <w:t xml:space="preserve">|     |   └──────────┘    |      |   └──────────┘    |                  |</w:t>
-      </w:r>
-      <w:r>
-        <w:br/>
-      </w:r>
-      <w:r>
-        <w:rPr>
-          <w:rStyle w:val="VerbatimChar"/>
-        </w:rPr>
-        <w:t xml:space="preserve">|     |   [  </w:t>
-      </w:r>
-      <w:r>
-        <w:rPr>
-          <w:rStyle w:val="VerbatimChar"/>
-          <w:rFonts w:hint="eastAsia"/>
-        </w:rPr>
-        <w:t xml:space="preserve">注分</w:t>
-      </w:r>
-      <w:r>
-        <w:rPr>
-          <w:rStyle w:val="VerbatimChar"/>
-        </w:rPr>
-        <w:t xml:space="preserve">  ]      |      |   [  </w:t>
-      </w:r>
-      <w:r>
-        <w:rPr>
-          <w:rStyle w:val="VerbatimChar"/>
-          <w:rFonts w:hint="eastAsia"/>
-        </w:rPr>
-        <w:t xml:space="preserve">洗分</w:t>
-      </w:r>
-      <w:r>
-        <w:rPr>
-          <w:rStyle w:val="VerbatimChar"/>
-        </w:rPr>
-        <w:t xml:space="preserve">  ]      |                  |</w:t>
-      </w:r>
-      <w:r>
-        <w:br/>
-      </w:r>
-      <w:r>
-        <w:rPr>
-          <w:rStyle w:val="VerbatimChar"/>
-        </w:rPr>
-        <w:t xml:space="preserve">|     |   </w:t>
-      </w:r>
-      <w:r>
-        <w:rPr>
-          <w:rStyle w:val="VerbatimChar"/>
-          <w:rFonts w:hint="eastAsia"/>
-        </w:rPr>
-        <w:t xml:space="preserve">(開分/充值)</w:t>
-      </w:r>
-      <w:r>
-        <w:rPr>
-          <w:rStyle w:val="VerbatimChar"/>
-        </w:rPr>
-        <w:t xml:space="preserve">     |      |   </w:t>
-      </w:r>
-      <w:r>
-        <w:rPr>
-          <w:rStyle w:val="VerbatimChar"/>
-          <w:rFonts w:hint="eastAsia"/>
-        </w:rPr>
-        <w:t xml:space="preserve">(結算/歸零)</w:t>
-      </w:r>
-      <w:r>
-        <w:rPr>
-          <w:rStyle w:val="VerbatimChar"/>
-        </w:rPr>
-        <w:t xml:space="preserve">     |                  |</w:t>
-      </w:r>
-      <w:r>
-        <w:br/>
-      </w:r>
-      <w:r>
-        <w:rPr>
-          <w:rStyle w:val="VerbatimChar"/>
-        </w:rPr>
-        <w:t xml:space="preserve">|     +------------------+      +------------------+                  |</w:t>
-      </w:r>
-      <w:r>
-        <w:br/>
-      </w:r>
-      <w:r>
-        <w:rPr>
-          <w:rStyle w:val="VerbatimChar"/>
-        </w:rPr>
-        <w:t xml:space="preserve">|                                                                      |</w:t>
-      </w:r>
-      <w:r>
-        <w:br/>
-      </w:r>
-      <w:r>
-        <w:rPr>
-          <w:rStyle w:val="VerbatimChar"/>
-        </w:rPr>
-        <w:t xml:space="preserve">|  ⏳ </w:t>
-      </w:r>
-      <w:r>
-        <w:rPr>
-          <w:rStyle w:val="VerbatimChar"/>
-          <w:rFonts w:hint="eastAsia"/>
-        </w:rPr>
-        <w:t xml:space="preserve">待同步佇列:</w:t>
-      </w:r>
-      <w:r>
-        <w:rPr>
-          <w:rStyle w:val="VerbatimChar"/>
-        </w:rPr>
-        <w:t xml:space="preserve"> 0 </w:t>
-      </w:r>
-      <w:r>
-        <w:rPr>
-          <w:rStyle w:val="VerbatimChar"/>
-          <w:rFonts w:hint="eastAsia"/>
-        </w:rPr>
-        <w:t xml:space="preserve">筆</w:t>
-      </w:r>
-      <w:r>
-        <w:rPr>
-          <w:rStyle w:val="VerbatimChar"/>
-        </w:rPr>
-        <w:t xml:space="preserve">                    </w:t>
-      </w:r>
-      <w:r>
-        <w:rPr>
-          <w:rStyle w:val="VerbatimChar"/>
-          <w:rFonts w:hint="eastAsia"/>
-        </w:rPr>
-        <w:t xml:space="preserve">[強制同步]</w:t>
-      </w:r>
-      <w:r>
-        <w:rPr>
-          <w:rStyle w:val="VerbatimChar"/>
-        </w:rPr>
-        <w:t xml:space="preserve">                   |</w:t>
-      </w:r>
-      <w:r>
-        <w:br/>
-      </w:r>
-      <w:r>
-        <w:rPr>
-          <w:rStyle w:val="VerbatimChar"/>
-        </w:rPr>
-        <w:t xml:space="preserve">|                                                                      |</w:t>
-      </w:r>
-      <w:r>
-        <w:br/>
-      </w:r>
-      <w:r>
-        <w:rPr>
-          <w:rStyle w:val="VerbatimChar"/>
-        </w:rPr>
-        <w:t xml:space="preserve">+======================================================================+</w:t>
-      </w:r>
-    </w:p>
-    <w:bookmarkEnd w:id="29"/>
-    <w:bookmarkStart w:id="30" w:name="畫面-2-本機設定介面"/>
+        <w:pStyle w:val="CaptionedFigure"/>
+      </w:pPr>
+      <w:r>
+        <w:drawing>
+          <wp:inline>
+            <wp:extent cx="5334000" cy="3333750"/>
+            <wp:effectExtent b="0" l="0" r="0" t="0"/>
+            <wp:docPr descr="安全的開洗分介面" title="" id="42" name="Picture"/>
+            <a:graphic>
+              <a:graphicData uri="http://schemas.openxmlformats.org/drawingml/2006/picture">
+                <pic:pic>
+                  <pic:nvPicPr>
+                    <pic:cNvPr descr="../assets/mockup_local_cash.png" id="43" name="Picture"/>
+                    <pic:cNvPicPr>
+                      <a:picLocks noChangeArrowheads="1" noChangeAspect="1"/>
+                    </pic:cNvPicPr>
+                  </pic:nvPicPr>
+                  <pic:blipFill>
+                    <a:blip r:embed="rId41"/>
+                    <a:stretch>
+                      <a:fillRect/>
+                    </a:stretch>
+                  </pic:blipFill>
+                  <pic:spPr bwMode="auto">
+                    <a:xfrm>
+                      <a:off x="0" y="0"/>
+                      <a:ext cx="5334000" cy="3333750"/>
+                    </a:xfrm>
+                    <a:prstGeom prst="rect">
+                      <a:avLst/>
+                    </a:prstGeom>
+                    <a:noFill/>
+                    <a:ln w="9525">
+                      <a:noFill/>
+                      <a:headEnd/>
+                      <a:tailEnd/>
+                    </a:ln>
+                  </pic:spPr>
+                </pic:pic>
+              </a:graphicData>
+            </a:graphic>
+          </wp:inline>
+        </w:drawing>
+      </w:r>
+    </w:p>
+    <w:p>
+      <w:pPr>
+        <w:pStyle w:val="ImageCaption"/>
+      </w:pPr>
+      <w:r>
+        <w:rPr>
+          <w:rFonts w:hint="eastAsia"/>
+        </w:rPr>
+        <w:t xml:space="preserve">安全的開洗分介面</w:t>
+      </w:r>
+    </w:p>
+    <w:bookmarkEnd w:id="44"/>
+    <w:bookmarkStart w:id="48" w:name="畫面-2-本機設定介面"/>
     <w:p>
       <w:pPr>
         <w:pStyle w:val="Heading4"/>
@@ -4741,388 +2600,60 @@
     </w:p>
     <w:p>
       <w:pPr>
-        <w:pStyle w:val="SourceCode"/>
-      </w:pPr>
-      <w:r>
-        <w:rPr>
-          <w:rStyle w:val="VerbatimChar"/>
-        </w:rPr>
-        <w:t xml:space="preserve">+======================================================================+</w:t>
-      </w:r>
-      <w:r>
-        <w:br/>
-      </w:r>
-      <w:r>
-        <w:rPr>
-          <w:rStyle w:val="VerbatimChar"/>
-        </w:rPr>
-        <w:t xml:space="preserve">|                    </w:t>
-      </w:r>
-      <w:r>
-        <w:rPr>
-          <w:rStyle w:val="VerbatimChar"/>
-          <w:rFonts w:hint="eastAsia"/>
-        </w:rPr>
-        <w:t xml:space="preserve">本機設定</w:t>
-      </w:r>
-      <w:r>
-        <w:rPr>
-          <w:rStyle w:val="VerbatimChar"/>
-        </w:rPr>
-        <w:t xml:space="preserve"> </w:t>
-      </w:r>
-      <w:r>
-        <w:rPr>
-          <w:rStyle w:val="VerbatimChar"/>
-          <w:rFonts w:hint="eastAsia"/>
-        </w:rPr>
-        <w:t xml:space="preserve">(需工程師密碼)</w:t>
-      </w:r>
-      <w:r>
-        <w:rPr>
-          <w:rStyle w:val="VerbatimChar"/>
-        </w:rPr>
-        <w:t xml:space="preserve">                            |</w:t>
-      </w:r>
-      <w:r>
-        <w:br/>
-      </w:r>
-      <w:r>
-        <w:rPr>
-          <w:rStyle w:val="VerbatimChar"/>
-        </w:rPr>
-        <w:t xml:space="preserve">+======================================================================+</w:t>
-      </w:r>
-      <w:r>
-        <w:br/>
-      </w:r>
-      <w:r>
-        <w:rPr>
-          <w:rStyle w:val="VerbatimChar"/>
-        </w:rPr>
-        <w:t xml:space="preserve">|                                                                      |</w:t>
-      </w:r>
-      <w:r>
-        <w:br/>
-      </w:r>
-      <w:r>
-        <w:rPr>
-          <w:rStyle w:val="VerbatimChar"/>
-        </w:rPr>
-        <w:t xml:space="preserve">|  ████ </w:t>
-      </w:r>
-      <w:r>
-        <w:rPr>
-          <w:rStyle w:val="VerbatimChar"/>
-          <w:rFonts w:hint="eastAsia"/>
-        </w:rPr>
-        <w:t xml:space="preserve">中央伺服器設定</w:t>
-      </w:r>
-      <w:r>
-        <w:rPr>
-          <w:rStyle w:val="VerbatimChar"/>
-        </w:rPr>
-        <w:t xml:space="preserve"> ████                                            |</w:t>
-      </w:r>
-      <w:r>
-        <w:br/>
-      </w:r>
-      <w:r>
-        <w:rPr>
-          <w:rStyle w:val="VerbatimChar"/>
-        </w:rPr>
-        <w:t xml:space="preserve">|                                                                      |</w:t>
-      </w:r>
-      <w:r>
-        <w:br/>
-      </w:r>
-      <w:r>
-        <w:rPr>
-          <w:rStyle w:val="VerbatimChar"/>
-        </w:rPr>
-        <w:t xml:space="preserve">|  API </w:t>
-      </w:r>
-      <w:r>
-        <w:rPr>
-          <w:rStyle w:val="VerbatimChar"/>
-          <w:rFonts w:hint="eastAsia"/>
-        </w:rPr>
-        <w:t xml:space="preserve">位址:</w:t>
-      </w:r>
-      <w:r>
-        <w:rPr>
-          <w:rStyle w:val="VerbatimChar"/>
-        </w:rPr>
-        <w:t xml:space="preserve">   [ https://api.gameplatform.com ]                       |</w:t>
-      </w:r>
-      <w:r>
-        <w:br/>
-      </w:r>
-      <w:r>
-        <w:rPr>
-          <w:rStyle w:val="VerbatimChar"/>
-        </w:rPr>
-        <w:t xml:space="preserve">|  API </w:t>
-      </w:r>
-      <w:r>
-        <w:rPr>
-          <w:rStyle w:val="VerbatimChar"/>
-          <w:rFonts w:hint="eastAsia"/>
-        </w:rPr>
-        <w:t xml:space="preserve">金鑰:</w:t>
-      </w:r>
-      <w:r>
-        <w:rPr>
-          <w:rStyle w:val="VerbatimChar"/>
-        </w:rPr>
-        <w:t xml:space="preserve">   [ ********************************* ]                  |</w:t>
-      </w:r>
-      <w:r>
-        <w:br/>
-      </w:r>
-      <w:r>
-        <w:rPr>
-          <w:rStyle w:val="VerbatimChar"/>
-        </w:rPr>
-        <w:t xml:space="preserve">|  </w:t>
-      </w:r>
-      <w:r>
-        <w:rPr>
-          <w:rStyle w:val="VerbatimChar"/>
-          <w:rFonts w:hint="eastAsia"/>
-        </w:rPr>
-        <w:t xml:space="preserve">機台序號:</w:t>
-      </w:r>
-      <w:r>
-        <w:rPr>
-          <w:rStyle w:val="VerbatimChar"/>
-        </w:rPr>
-        <w:t xml:space="preserve">   [ A-001                                                 |</w:t>
-      </w:r>
-      <w:r>
-        <w:br/>
-      </w:r>
-      <w:r>
-        <w:rPr>
-          <w:rStyle w:val="VerbatimChar"/>
-        </w:rPr>
-        <w:t xml:space="preserve">|                                                                      |</w:t>
-      </w:r>
-      <w:r>
-        <w:br/>
-      </w:r>
-      <w:r>
-        <w:rPr>
-          <w:rStyle w:val="VerbatimChar"/>
-        </w:rPr>
-        <w:t xml:space="preserve">|  ████ </w:t>
-      </w:r>
-      <w:r>
-        <w:rPr>
-          <w:rStyle w:val="VerbatimChar"/>
-          <w:rFonts w:hint="eastAsia"/>
-        </w:rPr>
-        <w:t xml:space="preserve">網路設定</w:t>
-      </w:r>
-      <w:r>
-        <w:rPr>
-          <w:rStyle w:val="VerbatimChar"/>
-        </w:rPr>
-        <w:t xml:space="preserve"> ████                                                  |</w:t>
-      </w:r>
-      <w:r>
-        <w:br/>
-      </w:r>
-      <w:r>
-        <w:rPr>
-          <w:rStyle w:val="VerbatimChar"/>
-        </w:rPr>
-        <w:t xml:space="preserve">|                                                                      |</w:t>
-      </w:r>
-      <w:r>
-        <w:br/>
-      </w:r>
-      <w:r>
-        <w:rPr>
-          <w:rStyle w:val="VerbatimChar"/>
-        </w:rPr>
-        <w:t xml:space="preserve">|  </w:t>
-      </w:r>
-      <w:r>
-        <w:rPr>
-          <w:rStyle w:val="VerbatimChar"/>
-          <w:rFonts w:hint="eastAsia"/>
-        </w:rPr>
-        <w:t xml:space="preserve">自動同步:</w:t>
-      </w:r>
-      <w:r>
-        <w:rPr>
-          <w:rStyle w:val="VerbatimChar"/>
-        </w:rPr>
-        <w:t xml:space="preserve">   </w:t>
-      </w:r>
-      <w:r>
-        <w:rPr>
-          <w:rStyle w:val="VerbatimChar"/>
-          <w:rFonts w:hint="eastAsia"/>
-        </w:rPr>
-        <w:t xml:space="preserve">[啟用</w:t>
-      </w:r>
-      <w:r>
-        <w:rPr>
-          <w:rStyle w:val="VerbatimChar"/>
-        </w:rPr>
-        <w:t xml:space="preserve"> ▼]          </w:t>
-      </w:r>
-      <w:r>
-        <w:rPr>
-          <w:rStyle w:val="VerbatimChar"/>
-          <w:rFonts w:hint="eastAsia"/>
-        </w:rPr>
-        <w:t xml:space="preserve">同步間隔:</w:t>
-      </w:r>
-      <w:r>
-        <w:rPr>
-          <w:rStyle w:val="VerbatimChar"/>
-        </w:rPr>
-        <w:t xml:space="preserve"> [ 3 </w:t>
-      </w:r>
-      <w:r>
-        <w:rPr>
-          <w:rStyle w:val="VerbatimChar"/>
-          <w:rFonts w:hint="eastAsia"/>
-        </w:rPr>
-        <w:t xml:space="preserve">分鐘</w:t>
-      </w:r>
-      <w:r>
-        <w:rPr>
-          <w:rStyle w:val="VerbatimChar"/>
-        </w:rPr>
-        <w:t xml:space="preserve"> ▼]                |</w:t>
-      </w:r>
-      <w:r>
-        <w:br/>
-      </w:r>
-      <w:r>
-        <w:rPr>
-          <w:rStyle w:val="VerbatimChar"/>
-        </w:rPr>
-        <w:t xml:space="preserve">|                                                                      |</w:t>
-      </w:r>
-      <w:r>
-        <w:br/>
-      </w:r>
-      <w:r>
-        <w:rPr>
-          <w:rStyle w:val="VerbatimChar"/>
-        </w:rPr>
-        <w:t xml:space="preserve">|  ████ </w:t>
-      </w:r>
-      <w:r>
-        <w:rPr>
-          <w:rStyle w:val="VerbatimChar"/>
-          <w:rFonts w:hint="eastAsia"/>
-        </w:rPr>
-        <w:t xml:space="preserve">安全設定</w:t>
-      </w:r>
-      <w:r>
-        <w:rPr>
-          <w:rStyle w:val="VerbatimChar"/>
-        </w:rPr>
-        <w:t xml:space="preserve"> ████                                                      |</w:t>
-      </w:r>
-      <w:r>
-        <w:br/>
-      </w:r>
-      <w:r>
-        <w:rPr>
-          <w:rStyle w:val="VerbatimChar"/>
-        </w:rPr>
-        <w:t xml:space="preserve">|                                                                      |</w:t>
-      </w:r>
-      <w:r>
-        <w:br/>
-      </w:r>
-      <w:r>
-        <w:rPr>
-          <w:rStyle w:val="VerbatimChar"/>
-        </w:rPr>
-        <w:t xml:space="preserve">|  PIN </w:t>
-      </w:r>
-      <w:r>
-        <w:rPr>
-          <w:rStyle w:val="VerbatimChar"/>
-          <w:rFonts w:hint="eastAsia"/>
-        </w:rPr>
-        <w:t xml:space="preserve">碼:</w:t>
-      </w:r>
-      <w:r>
-        <w:rPr>
-          <w:rStyle w:val="VerbatimChar"/>
-        </w:rPr>
-        <w:t xml:space="preserve">     [ **** ]                                                |</w:t>
-      </w:r>
-      <w:r>
-        <w:br/>
-      </w:r>
-      <w:r>
-        <w:rPr>
-          <w:rStyle w:val="VerbatimChar"/>
-        </w:rPr>
-        <w:t xml:space="preserve">|                                                                      |</w:t>
-      </w:r>
-      <w:r>
-        <w:br/>
-      </w:r>
-      <w:r>
-        <w:rPr>
-          <w:rStyle w:val="VerbatimChar"/>
-        </w:rPr>
-        <w:t xml:space="preserve">|                                              [ </w:t>
-      </w:r>
-      <w:r>
-        <w:rPr>
-          <w:rStyle w:val="VerbatimChar"/>
-          <w:rFonts w:hint="eastAsia"/>
-        </w:rPr>
-        <w:t xml:space="preserve">儲存</w:t>
-      </w:r>
-      <w:r>
-        <w:rPr>
-          <w:rStyle w:val="VerbatimChar"/>
-        </w:rPr>
-        <w:t xml:space="preserve"> ] [ </w:t>
-      </w:r>
-      <w:r>
-        <w:rPr>
-          <w:rStyle w:val="VerbatimChar"/>
-          <w:rFonts w:hint="eastAsia"/>
-        </w:rPr>
-        <w:t xml:space="preserve">取消</w:t>
-      </w:r>
-      <w:r>
-        <w:rPr>
-          <w:rStyle w:val="VerbatimChar"/>
-        </w:rPr>
-        <w:t xml:space="preserve"> ]       |</w:t>
-      </w:r>
-      <w:r>
-        <w:br/>
-      </w:r>
-      <w:r>
-        <w:rPr>
-          <w:rStyle w:val="VerbatimChar"/>
-        </w:rPr>
-        <w:t xml:space="preserve">|                                                                      |</w:t>
-      </w:r>
-      <w:r>
-        <w:br/>
-      </w:r>
-      <w:r>
-        <w:rPr>
-          <w:rStyle w:val="VerbatimChar"/>
-        </w:rPr>
-        <w:t xml:space="preserve">+======================================================================+</w:t>
+        <w:pStyle w:val="CaptionedFigure"/>
+      </w:pPr>
+      <w:r>
+        <w:drawing>
+          <wp:inline>
+            <wp:extent cx="5334000" cy="3333750"/>
+            <wp:effectExtent b="0" l="0" r="0" t="0"/>
+            <wp:docPr descr="本機設定介面" title="" id="46" name="Picture"/>
+            <a:graphic>
+              <a:graphicData uri="http://schemas.openxmlformats.org/drawingml/2006/picture">
+                <pic:pic>
+                  <pic:nvPicPr>
+                    <pic:cNvPr descr="../assets/mockup_mvp_local_setup.png" id="47" name="Picture"/>
+                    <pic:cNvPicPr>
+                      <a:picLocks noChangeArrowheads="1" noChangeAspect="1"/>
+                    </pic:cNvPicPr>
+                  </pic:nvPicPr>
+                  <pic:blipFill>
+                    <a:blip r:embed="rId45"/>
+                    <a:stretch>
+                      <a:fillRect/>
+                    </a:stretch>
+                  </pic:blipFill>
+                  <pic:spPr bwMode="auto">
+                    <a:xfrm>
+                      <a:off x="0" y="0"/>
+                      <a:ext cx="5334000" cy="3333750"/>
+                    </a:xfrm>
+                    <a:prstGeom prst="rect">
+                      <a:avLst/>
+                    </a:prstGeom>
+                    <a:noFill/>
+                    <a:ln w="9525">
+                      <a:noFill/>
+                      <a:headEnd/>
+                      <a:tailEnd/>
+                    </a:ln>
+                  </pic:spPr>
+                </pic:pic>
+              </a:graphicData>
+            </a:graphic>
+          </wp:inline>
+        </w:drawing>
+      </w:r>
+    </w:p>
+    <w:p>
+      <w:pPr>
+        <w:pStyle w:val="ImageCaption"/>
+      </w:pPr>
+      <w:r>
+        <w:rPr>
+          <w:rFonts w:hint="eastAsia"/>
+        </w:rPr>
+        <w:t xml:space="preserve">本機設定介面</w:t>
       </w:r>
     </w:p>
     <w:p>
@@ -5132,10 +2663,10 @@
         </w:pict>
       </w:r>
     </w:p>
-    <w:bookmarkEnd w:id="30"/>
-    <w:bookmarkEnd w:id="31"/>
-    <w:bookmarkEnd w:id="32"/>
-    <w:bookmarkStart w:id="37" w:name="詳細操作流程與usecase"/>
+    <w:bookmarkEnd w:id="48"/>
+    <w:bookmarkEnd w:id="49"/>
+    <w:bookmarkEnd w:id="50"/>
+    <w:bookmarkStart w:id="55" w:name="詳細操作流程與usecase"/>
     <w:p>
       <w:pPr>
         <w:pStyle w:val="Heading2"/>
@@ -5150,7 +2681,7 @@
         <w:t xml:space="preserve">詳細操作流程與UseCase</w:t>
       </w:r>
     </w:p>
-    <w:bookmarkStart w:id="35" w:name="X58fa065f55b162a3c9747a206d9acd74ed71854"/>
+    <w:bookmarkStart w:id="53" w:name="X58fa065f55b162a3c9747a206d9acd74ed71854"/>
     <w:p>
       <w:pPr>
         <w:pStyle w:val="Heading3"/>
@@ -5212,7 +2743,7 @@
         <w:t xml:space="preserve">現場操作員、機台本地伺服器</w:t>
       </w:r>
     </w:p>
-    <w:bookmarkStart w:id="33" w:name="階段一正常操作"/>
+    <w:bookmarkStart w:id="51" w:name="階段一正常操作"/>
     <w:p>
       <w:pPr>
         <w:pStyle w:val="Heading4"/>
@@ -5354,8 +2885,8 @@
         <w:t xml:space="preserve">已成功進分1,000，並已同步至中央」。</w:t>
       </w:r>
     </w:p>
-    <w:bookmarkEnd w:id="33"/>
-    <w:bookmarkStart w:id="34" w:name="階段二離線斷網保護"/>
+    <w:bookmarkEnd w:id="51"/>
+    <w:bookmarkStart w:id="52" w:name="階段二離線斷網保護"/>
     <w:p>
       <w:pPr>
         <w:pStyle w:val="Heading4"/>
@@ -5501,9 +3032,9 @@
         </w:pict>
       </w:r>
     </w:p>
-    <w:bookmarkEnd w:id="34"/>
-    <w:bookmarkEnd w:id="35"/>
-    <w:bookmarkStart w:id="36" w:name="use-case-2-本地機台連線設定-local-setup-ui"/>
+    <w:bookmarkEnd w:id="52"/>
+    <w:bookmarkEnd w:id="53"/>
+    <w:bookmarkStart w:id="54" w:name="use-case-2-本地機台連線設定-local-setup-ui"/>
     <w:p>
       <w:pPr>
         <w:pStyle w:val="Heading3"/>
@@ -5770,9 +3301,9 @@
         </w:pict>
       </w:r>
     </w:p>
-    <w:bookmarkEnd w:id="36"/>
-    <w:bookmarkEnd w:id="37"/>
-    <w:bookmarkStart w:id="41" w:name="共用元件規範"/>
+    <w:bookmarkEnd w:id="54"/>
+    <w:bookmarkEnd w:id="55"/>
+    <w:bookmarkStart w:id="59" w:name="共用元件規範"/>
     <w:p>
       <w:pPr>
         <w:pStyle w:val="Heading2"/>
@@ -5787,7 +3318,7 @@
         <w:t xml:space="preserve">共用元件規範</w:t>
       </w:r>
     </w:p>
-    <w:bookmarkStart w:id="38" w:name="按鈕元件"/>
+    <w:bookmarkStart w:id="56" w:name="按鈕元件"/>
     <w:p>
       <w:pPr>
         <w:pStyle w:val="Heading3"/>
@@ -6025,8 +3556,8 @@
         </w:tc>
       </w:tr>
     </w:tbl>
-    <w:bookmarkEnd w:id="38"/>
-    <w:bookmarkStart w:id="39" w:name="輸入元件"/>
+    <w:bookmarkEnd w:id="56"/>
+    <w:bookmarkStart w:id="57" w:name="輸入元件"/>
     <w:p>
       <w:pPr>
         <w:pStyle w:val="Heading3"/>
@@ -6110,8 +3641,8 @@
         <w:t xml:space="preserve">下拉選單：支援搜尋</w:t>
       </w:r>
     </w:p>
-    <w:bookmarkEnd w:id="39"/>
-    <w:bookmarkStart w:id="40" w:name="表格元件"/>
+    <w:bookmarkEnd w:id="57"/>
+    <w:bookmarkStart w:id="58" w:name="表格元件"/>
     <w:p>
       <w:pPr>
         <w:pStyle w:val="Heading3"/>
@@ -6211,9 +3742,9 @@
         </w:pict>
       </w:r>
     </w:p>
-    <w:bookmarkEnd w:id="40"/>
-    <w:bookmarkEnd w:id="41"/>
-    <w:bookmarkStart w:id="44" w:name="路由結構"/>
+    <w:bookmarkEnd w:id="58"/>
+    <w:bookmarkEnd w:id="59"/>
+    <w:bookmarkStart w:id="62" w:name="路由結構"/>
     <w:p>
       <w:pPr>
         <w:pStyle w:val="Heading2"/>
@@ -6228,7 +3759,7 @@
         <w:t xml:space="preserve">路由結構</w:t>
       </w:r>
     </w:p>
-    <w:bookmarkStart w:id="42" w:name="集中式後台路由"/>
+    <w:bookmarkStart w:id="60" w:name="集中式後台路由"/>
     <w:p>
       <w:pPr>
         <w:pStyle w:val="Heading3"/>
@@ -6592,8 +4123,8 @@
         </w:tc>
       </w:tr>
     </w:tbl>
-    <w:bookmarkEnd w:id="42"/>
-    <w:bookmarkStart w:id="43" w:name="單機本地後台路由"/>
+    <w:bookmarkEnd w:id="60"/>
+    <w:bookmarkStart w:id="61" w:name="單機本地後台路由"/>
     <w:p>
       <w:pPr>
         <w:pStyle w:val="Heading3"/>
@@ -6967,9 +4498,9 @@
         </w:pict>
       </w:r>
     </w:p>
-    <w:bookmarkEnd w:id="43"/>
-    <w:bookmarkEnd w:id="44"/>
-    <w:bookmarkStart w:id="47" w:name="響應式設計規範"/>
+    <w:bookmarkEnd w:id="61"/>
+    <w:bookmarkEnd w:id="62"/>
+    <w:bookmarkStart w:id="65" w:name="響應式設計規範"/>
     <w:p>
       <w:pPr>
         <w:pStyle w:val="Heading2"/>
@@ -6984,7 +4515,7 @@
         <w:t xml:space="preserve">響應式設計規範</w:t>
       </w:r>
     </w:p>
-    <w:bookmarkStart w:id="45" w:name="斷點設計"/>
+    <w:bookmarkStart w:id="63" w:name="斷點設計"/>
     <w:p>
       <w:pPr>
         <w:pStyle w:val="Heading3"/>
@@ -7172,8 +4703,8 @@
         </w:tc>
       </w:tr>
     </w:tbl>
-    <w:bookmarkEnd w:id="45"/>
-    <w:bookmarkStart w:id="46" w:name="觸控優化"/>
+    <w:bookmarkEnd w:id="63"/>
+    <w:bookmarkStart w:id="64" w:name="觸控優化"/>
     <w:p>
       <w:pPr>
         <w:pStyle w:val="Heading3"/>
@@ -7243,9 +4774,9 @@
         </w:pict>
       </w:r>
     </w:p>
-    <w:bookmarkEnd w:id="46"/>
-    <w:bookmarkEnd w:id="47"/>
-    <w:bookmarkStart w:id="50" w:name="附錄"/>
+    <w:bookmarkEnd w:id="64"/>
+    <w:bookmarkEnd w:id="65"/>
+    <w:bookmarkStart w:id="68" w:name="附錄"/>
     <w:p>
       <w:pPr>
         <w:pStyle w:val="Heading2"/>
@@ -7260,7 +4791,7 @@
         <w:t xml:space="preserve">附錄</w:t>
       </w:r>
     </w:p>
-    <w:bookmarkStart w:id="48" w:name="術語表"/>
+    <w:bookmarkStart w:id="66" w:name="術語表"/>
     <w:p>
       <w:pPr>
         <w:pStyle w:val="Heading3"/>
@@ -7454,8 +4985,8 @@
         </w:tc>
       </w:tr>
     </w:tbl>
-    <w:bookmarkEnd w:id="48"/>
-    <w:bookmarkStart w:id="49" w:name="版本歷史"/>
+    <w:bookmarkEnd w:id="66"/>
+    <w:bookmarkStart w:id="67" w:name="版本歷史"/>
     <w:p>
       <w:pPr>
         <w:pStyle w:val="Heading3"/>
@@ -7588,9 +5119,9 @@
         </w:tc>
       </w:tr>
     </w:tbl>
-    <w:bookmarkEnd w:id="49"/>
-    <w:bookmarkEnd w:id="50"/>
-    <w:bookmarkEnd w:id="51"/>
+    <w:bookmarkEnd w:id="67"/>
+    <w:bookmarkEnd w:id="68"/>
+    <w:bookmarkEnd w:id="69"/>
     <w:sectPr>
       <w:footnotePr>
         <w:numRestart w:val="eachSect"/>

</xml_diff>